<commit_message>
textos 3 ano até o 16
</commit_message>
<xml_diff>
--- a/docs/DocumentacaoSite.docx
+++ b/docs/DocumentacaoSite.docx
@@ -1132,7 +1132,7 @@
         <w:pStyle w:val="ListParagraph"/>
         <w:numPr>
           <w:ilvl w:val="0"/>
-          <w:numId w:val="4"/>
+          <w:numId w:val="5"/>
         </w:numPr>
         <w:spacing w:before="0" w:after="80"/>
         <w:rPr/>
@@ -1406,14 +1406,14 @@
         </w:tblCellMar>
       </w:tblPr>
       <w:tblGrid>
-        <w:gridCol w:w="2197"/>
-        <w:gridCol w:w="7163"/>
+        <w:gridCol w:w="2196"/>
+        <w:gridCol w:w="7164"/>
       </w:tblGrid>
       <w:tr>
         <w:trPr/>
         <w:tc>
           <w:tcPr>
-            <w:tcW w:w="2197" w:type="dxa"/>
+            <w:tcW w:w="2196" w:type="dxa"/>
             <w:tcBorders>
               <w:top w:val="single" w:sz="2" w:space="0" w:color="CCCCCC"/>
               <w:start w:val="single" w:sz="2" w:space="0" w:color="CCCCCC"/>
@@ -1441,7 +1441,7 @@
         </w:tc>
         <w:tc>
           <w:tcPr>
-            <w:tcW w:w="7163" w:type="dxa"/>
+            <w:tcW w:w="7164" w:type="dxa"/>
             <w:tcBorders>
               <w:top w:val="single" w:sz="2" w:space="0" w:color="CCCCCC"/>
               <w:start w:val="single" w:sz="2" w:space="0" w:color="CCCCCC"/>
@@ -1472,7 +1472,7 @@
         <w:trPr/>
         <w:tc>
           <w:tcPr>
-            <w:tcW w:w="2197" w:type="dxa"/>
+            <w:tcW w:w="2196" w:type="dxa"/>
             <w:tcBorders>
               <w:top w:val="single" w:sz="2" w:space="0" w:color="CCCCCC"/>
               <w:start w:val="single" w:sz="2" w:space="0" w:color="CCCCCC"/>
@@ -1500,7 +1500,7 @@
         </w:tc>
         <w:tc>
           <w:tcPr>
-            <w:tcW w:w="7163" w:type="dxa"/>
+            <w:tcW w:w="7164" w:type="dxa"/>
             <w:tcBorders>
               <w:top w:val="single" w:sz="2" w:space="0" w:color="CCCCCC"/>
               <w:start w:val="single" w:sz="2" w:space="0" w:color="CCCCCC"/>
@@ -1529,7 +1529,7 @@
         <w:trPr/>
         <w:tc>
           <w:tcPr>
-            <w:tcW w:w="2197" w:type="dxa"/>
+            <w:tcW w:w="2196" w:type="dxa"/>
             <w:tcBorders>
               <w:top w:val="single" w:sz="2" w:space="0" w:color="CCCCCC"/>
               <w:start w:val="single" w:sz="2" w:space="0" w:color="CCCCCC"/>
@@ -1557,7 +1557,7 @@
         </w:tc>
         <w:tc>
           <w:tcPr>
-            <w:tcW w:w="7163" w:type="dxa"/>
+            <w:tcW w:w="7164" w:type="dxa"/>
             <w:tcBorders>
               <w:top w:val="single" w:sz="2" w:space="0" w:color="CCCCCC"/>
               <w:start w:val="single" w:sz="2" w:space="0" w:color="CCCCCC"/>
@@ -1586,7 +1586,7 @@
         <w:trPr/>
         <w:tc>
           <w:tcPr>
-            <w:tcW w:w="2197" w:type="dxa"/>
+            <w:tcW w:w="2196" w:type="dxa"/>
             <w:tcBorders>
               <w:top w:val="single" w:sz="2" w:space="0" w:color="CCCCCC"/>
               <w:start w:val="single" w:sz="2" w:space="0" w:color="CCCCCC"/>
@@ -1614,7 +1614,7 @@
         </w:tc>
         <w:tc>
           <w:tcPr>
-            <w:tcW w:w="7163" w:type="dxa"/>
+            <w:tcW w:w="7164" w:type="dxa"/>
             <w:tcBorders>
               <w:top w:val="single" w:sz="2" w:space="0" w:color="CCCCCC"/>
               <w:start w:val="single" w:sz="2" w:space="0" w:color="CCCCCC"/>
@@ -1643,7 +1643,7 @@
         <w:trPr/>
         <w:tc>
           <w:tcPr>
-            <w:tcW w:w="2197" w:type="dxa"/>
+            <w:tcW w:w="2196" w:type="dxa"/>
             <w:tcBorders>
               <w:top w:val="single" w:sz="2" w:space="0" w:color="CCCCCC"/>
               <w:start w:val="single" w:sz="2" w:space="0" w:color="CCCCCC"/>
@@ -1671,7 +1671,7 @@
         </w:tc>
         <w:tc>
           <w:tcPr>
-            <w:tcW w:w="7163" w:type="dxa"/>
+            <w:tcW w:w="7164" w:type="dxa"/>
             <w:tcBorders>
               <w:top w:val="single" w:sz="2" w:space="0" w:color="CCCCCC"/>
               <w:start w:val="single" w:sz="2" w:space="0" w:color="CCCCCC"/>
@@ -1700,7 +1700,7 @@
         <w:trPr/>
         <w:tc>
           <w:tcPr>
-            <w:tcW w:w="2197" w:type="dxa"/>
+            <w:tcW w:w="2196" w:type="dxa"/>
             <w:tcBorders>
               <w:top w:val="single" w:sz="2" w:space="0" w:color="CCCCCC"/>
               <w:start w:val="single" w:sz="2" w:space="0" w:color="CCCCCC"/>
@@ -1728,7 +1728,7 @@
         </w:tc>
         <w:tc>
           <w:tcPr>
-            <w:tcW w:w="7163" w:type="dxa"/>
+            <w:tcW w:w="7164" w:type="dxa"/>
             <w:tcBorders>
               <w:top w:val="single" w:sz="2" w:space="0" w:color="CCCCCC"/>
               <w:start w:val="single" w:sz="2" w:space="0" w:color="CCCCCC"/>
@@ -1757,7 +1757,7 @@
         <w:trPr/>
         <w:tc>
           <w:tcPr>
-            <w:tcW w:w="2197" w:type="dxa"/>
+            <w:tcW w:w="2196" w:type="dxa"/>
             <w:tcBorders>
               <w:top w:val="single" w:sz="2" w:space="0" w:color="CCCCCC"/>
               <w:start w:val="single" w:sz="2" w:space="0" w:color="CCCCCC"/>
@@ -1785,7 +1785,7 @@
         </w:tc>
         <w:tc>
           <w:tcPr>
-            <w:tcW w:w="7163" w:type="dxa"/>
+            <w:tcW w:w="7164" w:type="dxa"/>
             <w:tcBorders>
               <w:top w:val="single" w:sz="2" w:space="0" w:color="CCCCCC"/>
               <w:start w:val="single" w:sz="2" w:space="0" w:color="CCCCCC"/>
@@ -1814,7 +1814,7 @@
         <w:trPr/>
         <w:tc>
           <w:tcPr>
-            <w:tcW w:w="2197" w:type="dxa"/>
+            <w:tcW w:w="2196" w:type="dxa"/>
             <w:tcBorders>
               <w:top w:val="single" w:sz="2" w:space="0" w:color="CCCCCC"/>
               <w:start w:val="single" w:sz="2" w:space="0" w:color="CCCCCC"/>
@@ -1842,7 +1842,7 @@
         </w:tc>
         <w:tc>
           <w:tcPr>
-            <w:tcW w:w="7163" w:type="dxa"/>
+            <w:tcW w:w="7164" w:type="dxa"/>
             <w:tcBorders>
               <w:top w:val="single" w:sz="2" w:space="0" w:color="CCCCCC"/>
               <w:start w:val="single" w:sz="2" w:space="0" w:color="CCCCCC"/>
@@ -1871,7 +1871,7 @@
         <w:trPr/>
         <w:tc>
           <w:tcPr>
-            <w:tcW w:w="2197" w:type="dxa"/>
+            <w:tcW w:w="2196" w:type="dxa"/>
             <w:tcBorders>
               <w:top w:val="single" w:sz="2" w:space="0" w:color="CCCCCC"/>
               <w:start w:val="single" w:sz="2" w:space="0" w:color="CCCCCC"/>
@@ -1899,7 +1899,7 @@
         </w:tc>
         <w:tc>
           <w:tcPr>
-            <w:tcW w:w="7163" w:type="dxa"/>
+            <w:tcW w:w="7164" w:type="dxa"/>
             <w:tcBorders>
               <w:top w:val="single" w:sz="2" w:space="0" w:color="CCCCCC"/>
               <w:start w:val="single" w:sz="2" w:space="0" w:color="CCCCCC"/>
@@ -9397,15 +9397,359 @@
       <w:pPr>
         <w:pStyle w:val="Normal"/>
         <w:spacing w:before="0" w:after="100"/>
-        <w:rPr/>
-      </w:pPr>
-      <w:r>
         <w:rPr>
           <w:rFonts w:eastAsia="Arial" w:cs="Arial"/>
           <w:sz w:val="22"/>
           <w:szCs w:val="22"/>
         </w:rPr>
-        <w:t>"Infográfico educativo vertical (proporção 9:16) no estilo roadmap, inspirado em materiais didáticos modernos. Estrada central em perspectiva. TEMA: [Título da Aula]. Cores sóbrias (azul, verde água, cinza). Ícones 2D limpos, mapas, gráficos simplificados, personagens minimalistas flat design."</w:t>
+      </w:pPr>
+      <w:r>
+        <w:rPr>
+          <w:rFonts w:eastAsia="Arial" w:cs="Arial"/>
+          <w:sz w:val="22"/>
+          <w:szCs w:val="22"/>
+        </w:rPr>
+        <w:t>"</w:t>
+      </w:r>
+      <w:r>
+        <w:rPr>
+          <w:rFonts w:eastAsia="Arial" w:cs="Arial"/>
+          <w:sz w:val="22"/>
+          <w:szCs w:val="22"/>
+        </w:rPr>
+        <w:t xml:space="preserve">Faça um </w:t>
+      </w:r>
+      <w:r>
+        <w:rPr>
+          <w:rFonts w:eastAsia="Arial" w:cs="Arial"/>
+          <w:sz w:val="22"/>
+          <w:szCs w:val="22"/>
+        </w:rPr>
+        <w:t>Infográfico educativo vertical (proporção 9:16) no estilo roadmap, inspirado em materiais didáticos modernos. Estrada central em perspectiva. TEMA: [Título da Aula]. Cores sóbrias (azul, verde água, cinza). Ícones 2D limpos, mapas, gráficos simplificados, personagens minimalistas flat design."</w:t>
+      </w:r>
+    </w:p>
+    <w:p>
+      <w:pPr>
+        <w:pStyle w:val="Normal"/>
+        <w:spacing w:before="0" w:after="100"/>
+        <w:rPr>
+          <w:rFonts w:eastAsia="Arial" w:cs="Arial"/>
+          <w:sz w:val="22"/>
+          <w:szCs w:val="22"/>
+        </w:rPr>
+      </w:pPr>
+      <w:r>
+        <w:rPr>
+          <w:rFonts w:eastAsia="Arial" w:cs="Arial"/>
+          <w:sz w:val="22"/>
+          <w:szCs w:val="22"/>
+        </w:rPr>
+      </w:r>
+    </w:p>
+    <w:p>
+      <w:pPr>
+        <w:pStyle w:val="Heading3"/>
+        <w:spacing w:before="0" w:after="100"/>
+        <w:rPr>
+          <w:rFonts w:ascii="Arial" w:hAnsi="Arial" w:eastAsia="Arial" w:cs="Arial"/>
+          <w:color w:val="auto"/>
+          <w:sz w:val="22"/>
+          <w:szCs w:val="22"/>
+        </w:rPr>
+      </w:pPr>
+      <w:r>
+        <w:rPr>
+          <w:rFonts w:eastAsia="Arial" w:cs="Arial" w:ascii="Arial" w:hAnsi="Arial"/>
+          <w:color w:val="auto"/>
+          <w:sz w:val="22"/>
+          <w:szCs w:val="22"/>
+        </w:rPr>
+        <w:t>Estrutura do Prompt Mestre (Copie e cole isso)</w:t>
+      </w:r>
+    </w:p>
+    <w:p>
+      <w:pPr>
+        <w:pStyle w:val="Blocodecitao"/>
+        <w:spacing w:before="0" w:after="100"/>
+        <w:rPr/>
+      </w:pPr>
+      <w:r>
+        <w:rPr>
+          <w:b/>
+        </w:rPr>
+        <w:t>Estilo Visual:</w:t>
+      </w:r>
+      <w:r>
+        <w:rPr/>
+        <w:t xml:space="preserve"> Utilizar o padrão de design "Clean Pixel" da marca Duvid Geografia. O visual deve equilibrar a clareza de interfaces modernas com a estética de jogos retrô 16-bit (pixel art).</w:t>
+      </w:r>
+    </w:p>
+    <w:p>
+      <w:pPr>
+        <w:pStyle w:val="Blocodecitao"/>
+        <w:spacing w:before="0" w:after="100"/>
+        <w:rPr/>
+      </w:pPr>
+      <w:r>
+        <w:rPr>
+          <w:b/>
+        </w:rPr>
+        <w:t>Fundo e Layout:</w:t>
+      </w:r>
+      <w:r>
+        <w:rPr/>
+        <w:t xml:space="preserve"> Fundo principal em cinza ultra-claro (</w:t>
+      </w:r>
+      <w:r>
+        <w:rPr>
+          <w:rStyle w:val="Cdigo-fonte"/>
+        </w:rPr>
+        <w:t>#f8f9fa</w:t>
+      </w:r>
+      <w:r>
+        <w:rPr/>
+        <w:t>). Usar grids limpos e generoso espaço em branco.</w:t>
+      </w:r>
+    </w:p>
+    <w:p>
+      <w:pPr>
+        <w:pStyle w:val="Blocodecitao"/>
+        <w:spacing w:before="0" w:after="100"/>
+        <w:rPr/>
+      </w:pPr>
+      <w:r>
+        <w:rPr>
+          <w:b/>
+        </w:rPr>
+        <w:t>Cards e UI:</w:t>
+      </w:r>
+      <w:r>
+        <w:rPr/>
+        <w:t xml:space="preserve"> Os elementos de informação devem estar dentro de cards brancos (</w:t>
+      </w:r>
+      <w:r>
+        <w:rPr>
+          <w:rStyle w:val="Cdigo-fonte"/>
+        </w:rPr>
+        <w:t>#ffffff</w:t>
+      </w:r>
+      <w:r>
+        <w:rPr/>
+        <w:t>), com cantos bem arredondados (raio de 24px a 32px) e uma sombra sólida na base para dar profundidade (</w:t>
+      </w:r>
+      <w:r>
+        <w:rPr>
+          <w:rStyle w:val="Cdigo-fonte"/>
+        </w:rPr>
+        <w:t>box-shadow: 0 4px 0 #1b5e20;</w:t>
+      </w:r>
+      <w:r>
+        <w:rPr/>
+        <w:t>).</w:t>
+      </w:r>
+    </w:p>
+    <w:p>
+      <w:pPr>
+        <w:pStyle w:val="Blocodecitao"/>
+        <w:spacing w:before="0" w:after="100"/>
+        <w:rPr>
+          <w:b/>
+        </w:rPr>
+      </w:pPr>
+      <w:r>
+        <w:rPr>
+          <w:b/>
+        </w:rPr>
+        <w:t>Paleta de Cores (GeoExplorer System):</w:t>
+      </w:r>
+    </w:p>
+    <w:p>
+      <w:pPr>
+        <w:pStyle w:val="Blocodecitao"/>
+        <w:numPr>
+          <w:ilvl w:val="0"/>
+          <w:numId w:val="3"/>
+        </w:numPr>
+        <w:tabs>
+          <w:tab w:val="clear" w:pos="720"/>
+          <w:tab w:val="left" w:pos="0" w:leader="none"/>
+        </w:tabs>
+        <w:spacing w:before="0" w:after="100"/>
+        <w:ind w:hanging="283" w:start="1276"/>
+        <w:rPr/>
+      </w:pPr>
+      <w:r>
+        <w:rPr/>
+        <w:t>Primária: Verde Forest Deep (</w:t>
+      </w:r>
+      <w:r>
+        <w:rPr>
+          <w:rStyle w:val="Cdigo-fonte"/>
+        </w:rPr>
+        <w:t>#2e7d32</w:t>
+      </w:r>
+      <w:r>
+        <w:rPr/>
+        <w:t>) para títulos e elementos principais.</w:t>
+      </w:r>
+    </w:p>
+    <w:p>
+      <w:pPr>
+        <w:pStyle w:val="Blocodecitao"/>
+        <w:numPr>
+          <w:ilvl w:val="0"/>
+          <w:numId w:val="3"/>
+        </w:numPr>
+        <w:tabs>
+          <w:tab w:val="clear" w:pos="720"/>
+          <w:tab w:val="left" w:pos="0" w:leader="none"/>
+        </w:tabs>
+        <w:spacing w:before="0" w:after="100"/>
+        <w:ind w:hanging="283" w:start="1276"/>
+        <w:rPr/>
+      </w:pPr>
+      <w:r>
+        <w:rPr/>
+        <w:t>Destaque: Verde Forest Vibrant (</w:t>
+      </w:r>
+      <w:r>
+        <w:rPr>
+          <w:rStyle w:val="Cdigo-fonte"/>
+        </w:rPr>
+        <w:t>#4caf50</w:t>
+      </w:r>
+      <w:r>
+        <w:rPr/>
+        <w:t>) para botões e success states.</w:t>
+      </w:r>
+    </w:p>
+    <w:p>
+      <w:pPr>
+        <w:pStyle w:val="Blocodecitao"/>
+        <w:numPr>
+          <w:ilvl w:val="0"/>
+          <w:numId w:val="3"/>
+        </w:numPr>
+        <w:tabs>
+          <w:tab w:val="clear" w:pos="720"/>
+          <w:tab w:val="left" w:pos="0" w:leader="none"/>
+        </w:tabs>
+        <w:spacing w:before="0" w:after="100"/>
+        <w:ind w:hanging="283" w:start="1276"/>
+        <w:rPr/>
+      </w:pPr>
+      <w:r>
+        <w:rPr/>
+        <w:t>Acento: Ouro Gamer (</w:t>
+      </w:r>
+      <w:r>
+        <w:rPr>
+          <w:rStyle w:val="Cdigo-fonte"/>
+        </w:rPr>
+        <w:t>#fbc02d</w:t>
+      </w:r>
+      <w:r>
+        <w:rPr/>
+        <w:t>) para moedas, badges e destaques de ranking.</w:t>
+      </w:r>
+    </w:p>
+    <w:p>
+      <w:pPr>
+        <w:pStyle w:val="Blocodecitao"/>
+        <w:spacing w:before="0" w:after="100"/>
+        <w:rPr/>
+      </w:pPr>
+      <w:r>
+        <w:rPr>
+          <w:b/>
+        </w:rPr>
+        <w:t>Tipografia:</w:t>
+      </w:r>
+      <w:r>
+        <w:rPr/>
+        <w:t xml:space="preserve"> Usar exclusivamente a fonte Montserrat para todo o texto.</w:t>
+      </w:r>
+    </w:p>
+    <w:p>
+      <w:pPr>
+        <w:pStyle w:val="Blocodecitao"/>
+        <w:spacing w:before="0" w:after="100"/>
+        <w:rPr/>
+      </w:pPr>
+      <w:r>
+        <w:rPr>
+          <w:b/>
+        </w:rPr>
+        <w:t>Iconografia e Ilustrações:</w:t>
+      </w:r>
+      <w:r>
+        <w:rPr/>
+        <w:t xml:space="preserve"> Todos os ícones e ilustrações devem ser renderizados em alta qualidade 16-bit pixel art.</w:t>
+      </w:r>
+    </w:p>
+    <w:p>
+      <w:pPr>
+        <w:pStyle w:val="Blocodecitao"/>
+        <w:spacing w:before="0" w:after="100"/>
+        <w:rPr/>
+      </w:pPr>
+      <w:r>
+        <w:rPr>
+          <w:b/>
+        </w:rPr>
+        <w:t>Conteúdo do Novo Infográfico:</w:t>
+      </w:r>
+      <w:r>
+        <w:rPr/>
+        <w:t xml:space="preserve"> [Substitua aqui pelo Título e Descrição dos seus novos dados, mantendo o tom de voz educativo e gamificado. Exemplo: </w:t>
+      </w:r>
+      <w:r>
+        <w:rPr>
+          <w:b/>
+        </w:rPr>
+        <w:t>Título Principal:</w:t>
+      </w:r>
+      <w:r>
+        <w:rPr/>
+        <w:t xml:space="preserve"> [TEMA CENTRAL] </w:t>
+      </w:r>
+      <w:r>
+        <w:rPr>
+          <w:b/>
+        </w:rPr>
+        <w:t>Subseção 1:</w:t>
+      </w:r>
+      <w:r>
+        <w:rPr/>
+        <w:t xml:space="preserve"> [Informações detalhadas com dados e ícones pixel art] </w:t>
+      </w:r>
+      <w:r>
+        <w:rPr>
+          <w:b/>
+        </w:rPr>
+        <w:t>Subseção 2:</w:t>
+      </w:r>
+      <w:r>
+        <w:rPr/>
+        <w:t xml:space="preserve"> [Outros dados, gráficos ou mapas] ]</w:t>
+      </w:r>
+    </w:p>
+    <w:p>
+      <w:pPr>
+        <w:pStyle w:val="Normal"/>
+        <w:spacing w:before="0" w:after="100"/>
+        <w:rPr>
+          <w:rFonts w:eastAsia="Arial" w:cs="Arial"/>
+          <w:sz w:val="22"/>
+          <w:szCs w:val="22"/>
+        </w:rPr>
+      </w:pPr>
+      <w:r>
+        <w:rPr>
+          <w:rFonts w:eastAsia="Arial" w:cs="Arial"/>
+          <w:sz w:val="22"/>
+          <w:szCs w:val="22"/>
+        </w:rPr>
       </w:r>
     </w:p>
     <w:p>
@@ -9458,9 +9802,6 @@
         <w:pStyle w:val="Normal"/>
         <w:spacing w:before="400" w:after="0"/>
         <w:jc w:val="center"/>
-        <w:rPr/>
-      </w:pPr>
-      <w:r>
         <w:rPr>
           <w:rFonts w:eastAsia="Arial" w:cs="Arial"/>
           <w:i/>
@@ -9469,7 +9810,85 @@
           <w:sz w:val="18"/>
           <w:szCs w:val="18"/>
         </w:rPr>
+      </w:pPr>
+      <w:r>
+        <w:rPr>
+          <w:rFonts w:eastAsia="Arial" w:cs="Arial"/>
+          <w:i/>
+          <w:iCs/>
+          <w:color w:val="888888"/>
+          <w:sz w:val="18"/>
+          <w:szCs w:val="18"/>
+        </w:rPr>
         <w:t>Atualizado em junho de 2026 — duvid.com.br</w:t>
+      </w:r>
+    </w:p>
+    <w:p>
+      <w:pPr>
+        <w:pStyle w:val="Normal"/>
+        <w:spacing w:before="400" w:after="0"/>
+        <w:jc w:val="center"/>
+        <w:rPr>
+          <w:rFonts w:eastAsia="Arial" w:cs="Arial"/>
+          <w:i/>
+          <w:iCs/>
+          <w:color w:val="888888"/>
+          <w:sz w:val="18"/>
+          <w:szCs w:val="18"/>
+        </w:rPr>
+      </w:pPr>
+      <w:r>
+        <w:rPr>
+          <w:rFonts w:eastAsia="Arial" w:cs="Arial"/>
+          <w:i/>
+          <w:iCs/>
+          <w:color w:val="888888"/>
+          <w:sz w:val="18"/>
+          <w:szCs w:val="18"/>
+        </w:rPr>
+      </w:r>
+    </w:p>
+    <w:p>
+      <w:pPr>
+        <w:pStyle w:val="Normal"/>
+        <w:spacing w:before="400" w:after="0"/>
+        <w:jc w:val="center"/>
+        <w:rPr>
+          <w:rFonts w:eastAsia="Arial" w:cs="Arial"/>
+          <w:i/>
+          <w:iCs/>
+          <w:color w:val="888888"/>
+          <w:sz w:val="18"/>
+          <w:szCs w:val="18"/>
+        </w:rPr>
+      </w:pPr>
+      <w:r>
+        <w:rPr>
+          <w:rFonts w:eastAsia="Arial" w:cs="Arial"/>
+          <w:i/>
+          <w:iCs/>
+          <w:color w:val="888888"/>
+          <w:sz w:val="18"/>
+          <w:szCs w:val="18"/>
+        </w:rPr>
+      </w:r>
+    </w:p>
+    <w:p>
+      <w:pPr>
+        <w:pStyle w:val="Normal"/>
+        <w:spacing w:before="0" w:after="100"/>
+        <w:rPr>
+          <w:rFonts w:ascii="Montserrat;sans-serif" w:hAnsi="Montserrat;sans-serif"/>
+          <w:b w:val="false"/>
+          <w:i w:val="false"/>
+          <w:caps w:val="false"/>
+          <w:smallCaps w:val="false"/>
+          <w:color w:val="2E7D32"/>
+          <w:spacing w:val="0"/>
+        </w:rPr>
+      </w:pPr>
+      <w:r>
+        <w:rPr/>
       </w:r>
     </w:p>
     <w:sectPr>
@@ -10022,6 +10441,143 @@
   <w:abstractNum w:abstractNumId="3">
     <w:lvl w:ilvl="0">
       <w:start w:val="1"/>
+      <w:numFmt w:val="bullet"/>
+      <w:lvlText w:val=""/>
+      <w:lvlJc w:val="start"/>
+      <w:pPr>
+        <w:tabs>
+          <w:tab w:val="num" w:pos="709"/>
+        </w:tabs>
+        <w:ind w:start="709" w:hanging="283"/>
+      </w:pPr>
+      <w:rPr>
+        <w:rFonts w:ascii="Symbol" w:hAnsi="Symbol" w:cs="Symbol" w:hint="default"/>
+      </w:rPr>
+    </w:lvl>
+    <w:lvl w:ilvl="1">
+      <w:start w:val="1"/>
+      <w:numFmt w:val="bullet"/>
+      <w:lvlText w:val=""/>
+      <w:lvlJc w:val="start"/>
+      <w:pPr>
+        <w:tabs>
+          <w:tab w:val="num" w:pos="1418"/>
+        </w:tabs>
+        <w:ind w:start="1418" w:hanging="283"/>
+      </w:pPr>
+      <w:rPr>
+        <w:rFonts w:ascii="Symbol" w:hAnsi="Symbol" w:cs="Symbol" w:hint="default"/>
+      </w:rPr>
+    </w:lvl>
+    <w:lvl w:ilvl="2">
+      <w:start w:val="1"/>
+      <w:numFmt w:val="bullet"/>
+      <w:lvlText w:val=""/>
+      <w:lvlJc w:val="start"/>
+      <w:pPr>
+        <w:tabs>
+          <w:tab w:val="num" w:pos="2127"/>
+        </w:tabs>
+        <w:ind w:start="2127" w:hanging="283"/>
+      </w:pPr>
+      <w:rPr>
+        <w:rFonts w:ascii="Symbol" w:hAnsi="Symbol" w:cs="Symbol" w:hint="default"/>
+      </w:rPr>
+    </w:lvl>
+    <w:lvl w:ilvl="3">
+      <w:start w:val="1"/>
+      <w:numFmt w:val="bullet"/>
+      <w:lvlText w:val=""/>
+      <w:lvlJc w:val="start"/>
+      <w:pPr>
+        <w:tabs>
+          <w:tab w:val="num" w:pos="2836"/>
+        </w:tabs>
+        <w:ind w:start="2836" w:hanging="283"/>
+      </w:pPr>
+      <w:rPr>
+        <w:rFonts w:ascii="Symbol" w:hAnsi="Symbol" w:cs="Symbol" w:hint="default"/>
+      </w:rPr>
+    </w:lvl>
+    <w:lvl w:ilvl="4">
+      <w:start w:val="1"/>
+      <w:numFmt w:val="bullet"/>
+      <w:lvlText w:val=""/>
+      <w:lvlJc w:val="start"/>
+      <w:pPr>
+        <w:tabs>
+          <w:tab w:val="num" w:pos="3545"/>
+        </w:tabs>
+        <w:ind w:start="3545" w:hanging="283"/>
+      </w:pPr>
+      <w:rPr>
+        <w:rFonts w:ascii="Symbol" w:hAnsi="Symbol" w:cs="Symbol" w:hint="default"/>
+      </w:rPr>
+    </w:lvl>
+    <w:lvl w:ilvl="5">
+      <w:start w:val="1"/>
+      <w:numFmt w:val="bullet"/>
+      <w:lvlText w:val=""/>
+      <w:lvlJc w:val="start"/>
+      <w:pPr>
+        <w:tabs>
+          <w:tab w:val="num" w:pos="4254"/>
+        </w:tabs>
+        <w:ind w:start="4254" w:hanging="283"/>
+      </w:pPr>
+      <w:rPr>
+        <w:rFonts w:ascii="Symbol" w:hAnsi="Symbol" w:cs="Symbol" w:hint="default"/>
+      </w:rPr>
+    </w:lvl>
+    <w:lvl w:ilvl="6">
+      <w:start w:val="1"/>
+      <w:numFmt w:val="bullet"/>
+      <w:lvlText w:val=""/>
+      <w:lvlJc w:val="start"/>
+      <w:pPr>
+        <w:tabs>
+          <w:tab w:val="num" w:pos="4963"/>
+        </w:tabs>
+        <w:ind w:start="4963" w:hanging="283"/>
+      </w:pPr>
+      <w:rPr>
+        <w:rFonts w:ascii="Symbol" w:hAnsi="Symbol" w:cs="Symbol" w:hint="default"/>
+      </w:rPr>
+    </w:lvl>
+    <w:lvl w:ilvl="7">
+      <w:start w:val="1"/>
+      <w:numFmt w:val="bullet"/>
+      <w:lvlText w:val=""/>
+      <w:lvlJc w:val="start"/>
+      <w:pPr>
+        <w:tabs>
+          <w:tab w:val="num" w:pos="5672"/>
+        </w:tabs>
+        <w:ind w:start="5672" w:hanging="283"/>
+      </w:pPr>
+      <w:rPr>
+        <w:rFonts w:ascii="Symbol" w:hAnsi="Symbol" w:cs="Symbol" w:hint="default"/>
+      </w:rPr>
+    </w:lvl>
+    <w:lvl w:ilvl="8">
+      <w:start w:val="1"/>
+      <w:numFmt w:val="bullet"/>
+      <w:lvlText w:val=""/>
+      <w:lvlJc w:val="start"/>
+      <w:pPr>
+        <w:tabs>
+          <w:tab w:val="num" w:pos="6381"/>
+        </w:tabs>
+        <w:ind w:start="6381" w:hanging="283"/>
+      </w:pPr>
+      <w:rPr>
+        <w:rFonts w:ascii="Symbol" w:hAnsi="Symbol" w:cs="Symbol" w:hint="default"/>
+      </w:rPr>
+    </w:lvl>
+  </w:abstractNum>
+  <w:abstractNum w:abstractNumId="4">
+    <w:lvl w:ilvl="0">
+      <w:start w:val="1"/>
       <w:numFmt w:val="none"/>
       <w:suff w:val="nothing"/>
       <w:lvlText w:val=""/>
@@ -10148,6 +10704,9 @@
     <w:abstractNumId w:val="3"/>
   </w:num>
   <w:num w:numId="4">
+    <w:abstractNumId w:val="4"/>
+  </w:num>
+  <w:num w:numId="5">
     <w:abstractNumId w:val="2"/>
     <w:lvlOverride w:ilvl="0">
       <w:startOverride w:val="1"/>
@@ -10194,7 +10753,7 @@
   </w:style>
   <w:style w:type="paragraph" w:styleId="Heading1">
     <w:name w:val="heading 1"/>
-    <w:basedOn w:val="Ttulo"/>
+    <w:basedOn w:val="Ttulouser"/>
     <w:qFormat/>
     <w:pPr>
       <w:spacing w:before="320" w:after="160"/>
@@ -10211,7 +10770,7 @@
   </w:style>
   <w:style w:type="paragraph" w:styleId="Heading2">
     <w:name w:val="heading 2"/>
-    <w:basedOn w:val="Ttulo"/>
+    <w:basedOn w:val="Ttulouser"/>
     <w:qFormat/>
     <w:pPr>
       <w:spacing w:before="240" w:after="120"/>
@@ -10228,7 +10787,7 @@
   </w:style>
   <w:style w:type="paragraph" w:styleId="Heading3">
     <w:name w:val="heading 3"/>
-    <w:basedOn w:val="Ttulo"/>
+    <w:basedOn w:val="Ttulouser"/>
     <w:qFormat/>
     <w:pPr/>
     <w:rPr>
@@ -10239,7 +10798,7 @@
   </w:style>
   <w:style w:type="paragraph" w:styleId="Heading4">
     <w:name w:val="heading 4"/>
-    <w:basedOn w:val="Ttulo"/>
+    <w:basedOn w:val="Ttulouser"/>
     <w:qFormat/>
     <w:pPr/>
     <w:rPr>
@@ -10250,7 +10809,7 @@
   </w:style>
   <w:style w:type="paragraph" w:styleId="Heading5">
     <w:name w:val="heading 5"/>
-    <w:basedOn w:val="Ttulo"/>
+    <w:basedOn w:val="Ttulouser"/>
     <w:qFormat/>
     <w:pPr/>
     <w:rPr>
@@ -10259,7 +10818,7 @@
   </w:style>
   <w:style w:type="paragraph" w:styleId="Heading6">
     <w:name w:val="heading 6"/>
-    <w:basedOn w:val="Ttulo"/>
+    <w:basedOn w:val="Ttulouser"/>
     <w:qFormat/>
     <w:pPr/>
     <w:rPr>
@@ -10275,8 +10834,8 @@
       <w:u w:val="single"/>
     </w:rPr>
   </w:style>
-  <w:style w:type="character" w:styleId="Caracteresdenotaderodap">
-    <w:name w:val="Caracteres de nota de rodapé"/>
+  <w:style w:type="character" w:styleId="Caracteresdenotaderodapuser">
+    <w:name w:val="Caracteres de nota de rodapé (user)"/>
     <w:uiPriority w:val="99"/>
     <w:semiHidden/>
     <w:unhideWhenUsed/>
@@ -10285,8 +10844,8 @@
       <w:vertAlign w:val="superscript"/>
     </w:rPr>
   </w:style>
-  <w:style w:type="character" w:styleId="Caracteresdenotaderodapuser">
-    <w:name w:val="Caracteres de nota de rodapé (user)"/>
+  <w:style w:type="character" w:styleId="Caracteresdenotaderodap">
+    <w:name w:val="Caracteres de nota de rodapé"/>
     <w:qFormat/>
     <w:rPr>
       <w:vertAlign w:val="superscript"/>
@@ -10309,8 +10868,8 @@
       <w:szCs w:val="20"/>
     </w:rPr>
   </w:style>
-  <w:style w:type="character" w:styleId="Caracteresdenotadefim">
-    <w:name w:val="Caracteres de nota de fim"/>
+  <w:style w:type="character" w:styleId="Caracteresdenotadefimuser">
+    <w:name w:val="Caracteres de nota de fim (user)"/>
     <w:uiPriority w:val="99"/>
     <w:semiHidden/>
     <w:unhideWhenUsed/>
@@ -10319,8 +10878,8 @@
       <w:vertAlign w:val="superscript"/>
     </w:rPr>
   </w:style>
-  <w:style w:type="character" w:styleId="Caracteresdenotadefimuser">
-    <w:name w:val="Caracteres de nota de fim (user)"/>
+  <w:style w:type="character" w:styleId="Caracteresdenotadefim">
+    <w:name w:val="Caracteres de nota de fim"/>
     <w:qFormat/>
     <w:rPr>
       <w:vertAlign w:val="superscript"/>
@@ -10343,15 +10902,29 @@
       <w:szCs w:val="20"/>
     </w:rPr>
   </w:style>
+  <w:style w:type="character" w:styleId="Vnculodendiceuser">
+    <w:name w:val="Vínculo de índice (user)"/>
+    <w:qFormat/>
+    <w:rPr/>
+  </w:style>
   <w:style w:type="character" w:styleId="Vnculodendice">
     <w:name w:val="Vínculo de índice"/>
     <w:qFormat/>
     <w:rPr/>
   </w:style>
-  <w:style w:type="character" w:styleId="Vnculodendiceuser">
-    <w:name w:val="Vínculo de índice (user)"/>
+  <w:style w:type="character" w:styleId="Cdigo-fonte">
+    <w:name w:val="Código-fonte"/>
     <w:qFormat/>
-    <w:rPr/>
+    <w:rPr>
+      <w:rFonts w:ascii="Liberation Mono" w:hAnsi="Liberation Mono" w:eastAsia="NSimSun" w:cs="Liberation Mono"/>
+    </w:rPr>
+  </w:style>
+  <w:style w:type="character" w:styleId="Marcadores">
+    <w:name w:val="Marcadores"/>
+    <w:qFormat/>
+    <w:rPr>
+      <w:rFonts w:ascii="OpenSymbol" w:hAnsi="OpenSymbol" w:eastAsia="OpenSymbol" w:cs="OpenSymbol"/>
+    </w:rPr>
   </w:style>
   <w:style w:type="paragraph" w:styleId="Ttulo">
     <w:name w:val="Título"/>
@@ -10439,7 +11012,7 @@
   </w:style>
   <w:style w:type="paragraph" w:styleId="Title">
     <w:name w:val="Title"/>
-    <w:basedOn w:val="Ttulo"/>
+    <w:basedOn w:val="Ttulouser"/>
     <w:qFormat/>
     <w:pPr/>
     <w:rPr>
@@ -10517,6 +11090,13 @@
       <w:szCs w:val="20"/>
     </w:rPr>
   </w:style>
+  <w:style w:type="paragraph" w:styleId="Cabealhoerodapuser">
+    <w:name w:val="Cabeçalho e rodapé (user)"/>
+    <w:basedOn w:val="Normal"/>
+    <w:qFormat/>
+    <w:pPr/>
+    <w:rPr/>
+  </w:style>
   <w:style w:type="paragraph" w:styleId="Cabealhoerodap">
     <w:name w:val="Cabeçalho e rodapé"/>
     <w:basedOn w:val="Normal"/>
@@ -10524,28 +11104,21 @@
     <w:pPr/>
     <w:rPr/>
   </w:style>
-  <w:style w:type="paragraph" w:styleId="Cabealhoerodapuser">
-    <w:name w:val="Cabeçalho e rodapé (user)"/>
-    <w:basedOn w:val="Normal"/>
-    <w:qFormat/>
-    <w:pPr/>
-    <w:rPr/>
-  </w:style>
   <w:style w:type="paragraph" w:styleId="Header">
     <w:name w:val="header"/>
-    <w:basedOn w:val="Cabealhoerodap"/>
+    <w:basedOn w:val="Cabealhoerodapuser"/>
     <w:pPr/>
     <w:rPr/>
   </w:style>
   <w:style w:type="paragraph" w:styleId="Footer">
     <w:name w:val="footer"/>
-    <w:basedOn w:val="Cabealhoerodap"/>
+    <w:basedOn w:val="Cabealhoerodapuser"/>
     <w:pPr/>
     <w:rPr/>
   </w:style>
   <w:style w:type="paragraph" w:styleId="IndexHeading">
     <w:name w:val="index heading"/>
-    <w:basedOn w:val="Ttulo"/>
+    <w:basedOn w:val="Ttulouser"/>
     <w:pPr>
       <w:suppressLineNumbers/>
       <w:ind w:hanging="0" w:start="0"/>
@@ -10574,7 +11147,7 @@
   </w:style>
   <w:style w:type="paragraph" w:styleId="TOC1">
     <w:name w:val="toc 1"/>
-    <w:basedOn w:val="ndice"/>
+    <w:basedOn w:val="ndiceuser"/>
     <w:pPr>
       <w:tabs>
         <w:tab w:val="clear" w:pos="720"/>
@@ -10586,13 +11159,23 @@
   </w:style>
   <w:style w:type="paragraph" w:styleId="TOC2">
     <w:name w:val="toc 2"/>
-    <w:basedOn w:val="ndice"/>
+    <w:basedOn w:val="ndiceuser"/>
     <w:pPr>
       <w:tabs>
         <w:tab w:val="clear" w:pos="720"/>
         <w:tab w:val="right" w:pos="9077" w:leader="dot"/>
       </w:tabs>
       <w:ind w:hanging="0" w:start="283"/>
+    </w:pPr>
+    <w:rPr/>
+  </w:style>
+  <w:style w:type="paragraph" w:styleId="Blocodecitao">
+    <w:name w:val="Bloco de citação"/>
+    <w:basedOn w:val="Normal"/>
+    <w:qFormat/>
+    <w:pPr>
+      <w:spacing w:before="0" w:after="283"/>
+      <w:ind w:hanging="0" w:start="567" w:end="567"/>
     </w:pPr>
     <w:rPr/>
   </w:style>

</xml_diff>

<commit_message>
Textos novos do 3 ano
</commit_message>
<xml_diff>
--- a/docs/DocumentacaoSite.docx
+++ b/docs/DocumentacaoSite.docx
@@ -1151,7 +1151,7 @@
         <w:pStyle w:val="ListParagraph"/>
         <w:numPr>
           <w:ilvl w:val="0"/>
-          <w:numId w:val="2"/>
+          <w:numId w:val="3"/>
         </w:numPr>
         <w:spacing w:before="0" w:after="80"/>
         <w:rPr/>
@@ -1170,7 +1170,7 @@
         <w:pStyle w:val="ListParagraph"/>
         <w:numPr>
           <w:ilvl w:val="0"/>
-          <w:numId w:val="2"/>
+          <w:numId w:val="3"/>
         </w:numPr>
         <w:spacing w:before="0" w:after="80"/>
         <w:rPr/>
@@ -1189,7 +1189,7 @@
         <w:pStyle w:val="ListParagraph"/>
         <w:numPr>
           <w:ilvl w:val="0"/>
-          <w:numId w:val="2"/>
+          <w:numId w:val="3"/>
         </w:numPr>
         <w:spacing w:before="0" w:after="80"/>
         <w:rPr/>
@@ -1208,7 +1208,7 @@
         <w:pStyle w:val="ListParagraph"/>
         <w:numPr>
           <w:ilvl w:val="0"/>
-          <w:numId w:val="2"/>
+          <w:numId w:val="3"/>
         </w:numPr>
         <w:spacing w:before="0" w:after="80"/>
         <w:rPr/>
@@ -1227,7 +1227,7 @@
         <w:pStyle w:val="ListParagraph"/>
         <w:numPr>
           <w:ilvl w:val="0"/>
-          <w:numId w:val="2"/>
+          <w:numId w:val="3"/>
         </w:numPr>
         <w:spacing w:before="0" w:after="80"/>
         <w:rPr/>
@@ -1246,7 +1246,7 @@
         <w:pStyle w:val="ListParagraph"/>
         <w:numPr>
           <w:ilvl w:val="0"/>
-          <w:numId w:val="2"/>
+          <w:numId w:val="3"/>
         </w:numPr>
         <w:spacing w:before="0" w:after="80"/>
         <w:rPr/>
@@ -1265,7 +1265,7 @@
         <w:pStyle w:val="ListParagraph"/>
         <w:numPr>
           <w:ilvl w:val="0"/>
-          <w:numId w:val="2"/>
+          <w:numId w:val="3"/>
         </w:numPr>
         <w:spacing w:before="0" w:after="80"/>
         <w:rPr/>
@@ -1284,7 +1284,7 @@
         <w:pStyle w:val="ListParagraph"/>
         <w:numPr>
           <w:ilvl w:val="0"/>
-          <w:numId w:val="2"/>
+          <w:numId w:val="3"/>
         </w:numPr>
         <w:spacing w:before="0" w:after="80"/>
         <w:rPr/>
@@ -1406,14 +1406,14 @@
         </w:tblCellMar>
       </w:tblPr>
       <w:tblGrid>
-        <w:gridCol w:w="2196"/>
-        <w:gridCol w:w="7164"/>
+        <w:gridCol w:w="2195"/>
+        <w:gridCol w:w="7165"/>
       </w:tblGrid>
       <w:tr>
         <w:trPr/>
         <w:tc>
           <w:tcPr>
-            <w:tcW w:w="2196" w:type="dxa"/>
+            <w:tcW w:w="2195" w:type="dxa"/>
             <w:tcBorders>
               <w:top w:val="single" w:sz="2" w:space="0" w:color="CCCCCC"/>
               <w:start w:val="single" w:sz="2" w:space="0" w:color="CCCCCC"/>
@@ -1441,7 +1441,7 @@
         </w:tc>
         <w:tc>
           <w:tcPr>
-            <w:tcW w:w="7164" w:type="dxa"/>
+            <w:tcW w:w="7165" w:type="dxa"/>
             <w:tcBorders>
               <w:top w:val="single" w:sz="2" w:space="0" w:color="CCCCCC"/>
               <w:start w:val="single" w:sz="2" w:space="0" w:color="CCCCCC"/>
@@ -1472,7 +1472,7 @@
         <w:trPr/>
         <w:tc>
           <w:tcPr>
-            <w:tcW w:w="2196" w:type="dxa"/>
+            <w:tcW w:w="2195" w:type="dxa"/>
             <w:tcBorders>
               <w:top w:val="single" w:sz="2" w:space="0" w:color="CCCCCC"/>
               <w:start w:val="single" w:sz="2" w:space="0" w:color="CCCCCC"/>
@@ -1500,7 +1500,7 @@
         </w:tc>
         <w:tc>
           <w:tcPr>
-            <w:tcW w:w="7164" w:type="dxa"/>
+            <w:tcW w:w="7165" w:type="dxa"/>
             <w:tcBorders>
               <w:top w:val="single" w:sz="2" w:space="0" w:color="CCCCCC"/>
               <w:start w:val="single" w:sz="2" w:space="0" w:color="CCCCCC"/>
@@ -1529,7 +1529,7 @@
         <w:trPr/>
         <w:tc>
           <w:tcPr>
-            <w:tcW w:w="2196" w:type="dxa"/>
+            <w:tcW w:w="2195" w:type="dxa"/>
             <w:tcBorders>
               <w:top w:val="single" w:sz="2" w:space="0" w:color="CCCCCC"/>
               <w:start w:val="single" w:sz="2" w:space="0" w:color="CCCCCC"/>
@@ -1557,7 +1557,7 @@
         </w:tc>
         <w:tc>
           <w:tcPr>
-            <w:tcW w:w="7164" w:type="dxa"/>
+            <w:tcW w:w="7165" w:type="dxa"/>
             <w:tcBorders>
               <w:top w:val="single" w:sz="2" w:space="0" w:color="CCCCCC"/>
               <w:start w:val="single" w:sz="2" w:space="0" w:color="CCCCCC"/>
@@ -1586,7 +1586,7 @@
         <w:trPr/>
         <w:tc>
           <w:tcPr>
-            <w:tcW w:w="2196" w:type="dxa"/>
+            <w:tcW w:w="2195" w:type="dxa"/>
             <w:tcBorders>
               <w:top w:val="single" w:sz="2" w:space="0" w:color="CCCCCC"/>
               <w:start w:val="single" w:sz="2" w:space="0" w:color="CCCCCC"/>
@@ -1614,7 +1614,7 @@
         </w:tc>
         <w:tc>
           <w:tcPr>
-            <w:tcW w:w="7164" w:type="dxa"/>
+            <w:tcW w:w="7165" w:type="dxa"/>
             <w:tcBorders>
               <w:top w:val="single" w:sz="2" w:space="0" w:color="CCCCCC"/>
               <w:start w:val="single" w:sz="2" w:space="0" w:color="CCCCCC"/>
@@ -1643,7 +1643,7 @@
         <w:trPr/>
         <w:tc>
           <w:tcPr>
-            <w:tcW w:w="2196" w:type="dxa"/>
+            <w:tcW w:w="2195" w:type="dxa"/>
             <w:tcBorders>
               <w:top w:val="single" w:sz="2" w:space="0" w:color="CCCCCC"/>
               <w:start w:val="single" w:sz="2" w:space="0" w:color="CCCCCC"/>
@@ -1671,7 +1671,7 @@
         </w:tc>
         <w:tc>
           <w:tcPr>
-            <w:tcW w:w="7164" w:type="dxa"/>
+            <w:tcW w:w="7165" w:type="dxa"/>
             <w:tcBorders>
               <w:top w:val="single" w:sz="2" w:space="0" w:color="CCCCCC"/>
               <w:start w:val="single" w:sz="2" w:space="0" w:color="CCCCCC"/>
@@ -1700,7 +1700,7 @@
         <w:trPr/>
         <w:tc>
           <w:tcPr>
-            <w:tcW w:w="2196" w:type="dxa"/>
+            <w:tcW w:w="2195" w:type="dxa"/>
             <w:tcBorders>
               <w:top w:val="single" w:sz="2" w:space="0" w:color="CCCCCC"/>
               <w:start w:val="single" w:sz="2" w:space="0" w:color="CCCCCC"/>
@@ -1728,7 +1728,7 @@
         </w:tc>
         <w:tc>
           <w:tcPr>
-            <w:tcW w:w="7164" w:type="dxa"/>
+            <w:tcW w:w="7165" w:type="dxa"/>
             <w:tcBorders>
               <w:top w:val="single" w:sz="2" w:space="0" w:color="CCCCCC"/>
               <w:start w:val="single" w:sz="2" w:space="0" w:color="CCCCCC"/>
@@ -1757,7 +1757,7 @@
         <w:trPr/>
         <w:tc>
           <w:tcPr>
-            <w:tcW w:w="2196" w:type="dxa"/>
+            <w:tcW w:w="2195" w:type="dxa"/>
             <w:tcBorders>
               <w:top w:val="single" w:sz="2" w:space="0" w:color="CCCCCC"/>
               <w:start w:val="single" w:sz="2" w:space="0" w:color="CCCCCC"/>
@@ -1785,7 +1785,7 @@
         </w:tc>
         <w:tc>
           <w:tcPr>
-            <w:tcW w:w="7164" w:type="dxa"/>
+            <w:tcW w:w="7165" w:type="dxa"/>
             <w:tcBorders>
               <w:top w:val="single" w:sz="2" w:space="0" w:color="CCCCCC"/>
               <w:start w:val="single" w:sz="2" w:space="0" w:color="CCCCCC"/>
@@ -1814,7 +1814,7 @@
         <w:trPr/>
         <w:tc>
           <w:tcPr>
-            <w:tcW w:w="2196" w:type="dxa"/>
+            <w:tcW w:w="2195" w:type="dxa"/>
             <w:tcBorders>
               <w:top w:val="single" w:sz="2" w:space="0" w:color="CCCCCC"/>
               <w:start w:val="single" w:sz="2" w:space="0" w:color="CCCCCC"/>
@@ -1842,7 +1842,7 @@
         </w:tc>
         <w:tc>
           <w:tcPr>
-            <w:tcW w:w="7164" w:type="dxa"/>
+            <w:tcW w:w="7165" w:type="dxa"/>
             <w:tcBorders>
               <w:top w:val="single" w:sz="2" w:space="0" w:color="CCCCCC"/>
               <w:start w:val="single" w:sz="2" w:space="0" w:color="CCCCCC"/>
@@ -1871,7 +1871,7 @@
         <w:trPr/>
         <w:tc>
           <w:tcPr>
-            <w:tcW w:w="2196" w:type="dxa"/>
+            <w:tcW w:w="2195" w:type="dxa"/>
             <w:tcBorders>
               <w:top w:val="single" w:sz="2" w:space="0" w:color="CCCCCC"/>
               <w:start w:val="single" w:sz="2" w:space="0" w:color="CCCCCC"/>
@@ -1899,7 +1899,7 @@
         </w:tc>
         <w:tc>
           <w:tcPr>
-            <w:tcW w:w="7164" w:type="dxa"/>
+            <w:tcW w:w="7165" w:type="dxa"/>
             <w:tcBorders>
               <w:top w:val="single" w:sz="2" w:space="0" w:color="CCCCCC"/>
               <w:start w:val="single" w:sz="2" w:space="0" w:color="CCCCCC"/>
@@ -4222,7 +4222,7 @@
         <w:pStyle w:val="ListParagraph"/>
         <w:numPr>
           <w:ilvl w:val="0"/>
-          <w:numId w:val="2"/>
+          <w:numId w:val="3"/>
         </w:numPr>
         <w:spacing w:before="0" w:after="80"/>
         <w:rPr/>
@@ -4241,7 +4241,7 @@
         <w:pStyle w:val="ListParagraph"/>
         <w:numPr>
           <w:ilvl w:val="0"/>
-          <w:numId w:val="2"/>
+          <w:numId w:val="3"/>
         </w:numPr>
         <w:spacing w:before="0" w:after="80"/>
         <w:rPr/>
@@ -4260,7 +4260,7 @@
         <w:pStyle w:val="ListParagraph"/>
         <w:numPr>
           <w:ilvl w:val="0"/>
-          <w:numId w:val="2"/>
+          <w:numId w:val="3"/>
         </w:numPr>
         <w:spacing w:before="0" w:after="80"/>
         <w:rPr/>
@@ -4364,7 +4364,7 @@
         <w:pStyle w:val="ListParagraph"/>
         <w:numPr>
           <w:ilvl w:val="0"/>
-          <w:numId w:val="2"/>
+          <w:numId w:val="3"/>
         </w:numPr>
         <w:spacing w:before="0" w:after="80"/>
         <w:rPr/>
@@ -4383,7 +4383,7 @@
         <w:pStyle w:val="ListParagraph"/>
         <w:numPr>
           <w:ilvl w:val="0"/>
-          <w:numId w:val="2"/>
+          <w:numId w:val="3"/>
         </w:numPr>
         <w:spacing w:before="0" w:after="80"/>
         <w:rPr/>
@@ -4402,7 +4402,7 @@
         <w:pStyle w:val="ListParagraph"/>
         <w:numPr>
           <w:ilvl w:val="0"/>
-          <w:numId w:val="2"/>
+          <w:numId w:val="3"/>
         </w:numPr>
         <w:spacing w:before="0" w:after="80"/>
         <w:rPr/>
@@ -4421,7 +4421,7 @@
         <w:pStyle w:val="ListParagraph"/>
         <w:numPr>
           <w:ilvl w:val="0"/>
-          <w:numId w:val="2"/>
+          <w:numId w:val="3"/>
         </w:numPr>
         <w:spacing w:before="0" w:after="80"/>
         <w:rPr/>
@@ -5055,7 +5055,7 @@
         <w:pStyle w:val="ListParagraph"/>
         <w:numPr>
           <w:ilvl w:val="0"/>
-          <w:numId w:val="2"/>
+          <w:numId w:val="3"/>
         </w:numPr>
         <w:spacing w:before="0" w:after="80"/>
         <w:rPr/>
@@ -5074,7 +5074,7 @@
         <w:pStyle w:val="ListParagraph"/>
         <w:numPr>
           <w:ilvl w:val="0"/>
-          <w:numId w:val="2"/>
+          <w:numId w:val="3"/>
         </w:numPr>
         <w:spacing w:before="0" w:after="80"/>
         <w:rPr/>
@@ -5093,7 +5093,7 @@
         <w:pStyle w:val="ListParagraph"/>
         <w:numPr>
           <w:ilvl w:val="0"/>
-          <w:numId w:val="2"/>
+          <w:numId w:val="3"/>
         </w:numPr>
         <w:spacing w:before="0" w:after="80"/>
         <w:rPr/>
@@ -5112,7 +5112,7 @@
         <w:pStyle w:val="ListParagraph"/>
         <w:numPr>
           <w:ilvl w:val="0"/>
-          <w:numId w:val="2"/>
+          <w:numId w:val="3"/>
         </w:numPr>
         <w:spacing w:before="0" w:after="80"/>
         <w:rPr/>
@@ -5131,7 +5131,7 @@
         <w:pStyle w:val="ListParagraph"/>
         <w:numPr>
           <w:ilvl w:val="0"/>
-          <w:numId w:val="2"/>
+          <w:numId w:val="3"/>
         </w:numPr>
         <w:spacing w:before="0" w:after="80"/>
         <w:rPr/>
@@ -5170,7 +5170,7 @@
         <w:pStyle w:val="ListParagraph"/>
         <w:numPr>
           <w:ilvl w:val="0"/>
-          <w:numId w:val="2"/>
+          <w:numId w:val="3"/>
         </w:numPr>
         <w:spacing w:before="0" w:after="80"/>
         <w:rPr/>
@@ -5189,7 +5189,7 @@
         <w:pStyle w:val="ListParagraph"/>
         <w:numPr>
           <w:ilvl w:val="0"/>
-          <w:numId w:val="2"/>
+          <w:numId w:val="3"/>
         </w:numPr>
         <w:spacing w:before="0" w:after="80"/>
         <w:rPr/>
@@ -5208,7 +5208,7 @@
         <w:pStyle w:val="ListParagraph"/>
         <w:numPr>
           <w:ilvl w:val="0"/>
-          <w:numId w:val="2"/>
+          <w:numId w:val="3"/>
         </w:numPr>
         <w:spacing w:before="0" w:after="80"/>
         <w:rPr/>
@@ -5227,7 +5227,7 @@
         <w:pStyle w:val="ListParagraph"/>
         <w:numPr>
           <w:ilvl w:val="0"/>
-          <w:numId w:val="2"/>
+          <w:numId w:val="3"/>
         </w:numPr>
         <w:spacing w:before="0" w:after="80"/>
         <w:rPr/>
@@ -5266,7 +5266,7 @@
         <w:pStyle w:val="ListParagraph"/>
         <w:numPr>
           <w:ilvl w:val="0"/>
-          <w:numId w:val="2"/>
+          <w:numId w:val="3"/>
         </w:numPr>
         <w:spacing w:before="0" w:after="80"/>
         <w:rPr/>
@@ -5285,7 +5285,7 @@
         <w:pStyle w:val="ListParagraph"/>
         <w:numPr>
           <w:ilvl w:val="0"/>
-          <w:numId w:val="2"/>
+          <w:numId w:val="3"/>
         </w:numPr>
         <w:spacing w:before="0" w:after="80"/>
         <w:rPr/>
@@ -5304,7 +5304,7 @@
         <w:pStyle w:val="ListParagraph"/>
         <w:numPr>
           <w:ilvl w:val="0"/>
-          <w:numId w:val="2"/>
+          <w:numId w:val="3"/>
         </w:numPr>
         <w:spacing w:before="0" w:after="80"/>
         <w:rPr/>
@@ -5343,7 +5343,7 @@
         <w:pStyle w:val="ListParagraph"/>
         <w:numPr>
           <w:ilvl w:val="0"/>
-          <w:numId w:val="2"/>
+          <w:numId w:val="3"/>
         </w:numPr>
         <w:spacing w:before="0" w:after="80"/>
         <w:rPr/>
@@ -5362,7 +5362,7 @@
         <w:pStyle w:val="ListParagraph"/>
         <w:numPr>
           <w:ilvl w:val="0"/>
-          <w:numId w:val="2"/>
+          <w:numId w:val="3"/>
         </w:numPr>
         <w:spacing w:before="0" w:after="80"/>
         <w:rPr/>
@@ -5381,7 +5381,7 @@
         <w:pStyle w:val="ListParagraph"/>
         <w:numPr>
           <w:ilvl w:val="0"/>
-          <w:numId w:val="2"/>
+          <w:numId w:val="3"/>
         </w:numPr>
         <w:spacing w:before="0" w:after="80"/>
         <w:rPr/>
@@ -5400,7 +5400,7 @@
         <w:pStyle w:val="ListParagraph"/>
         <w:numPr>
           <w:ilvl w:val="0"/>
-          <w:numId w:val="2"/>
+          <w:numId w:val="3"/>
         </w:numPr>
         <w:spacing w:before="0" w:after="80"/>
         <w:rPr/>
@@ -5419,7 +5419,7 @@
         <w:pStyle w:val="ListParagraph"/>
         <w:numPr>
           <w:ilvl w:val="0"/>
-          <w:numId w:val="2"/>
+          <w:numId w:val="3"/>
         </w:numPr>
         <w:spacing w:before="0" w:after="80"/>
         <w:rPr/>
@@ -5458,7 +5458,7 @@
         <w:pStyle w:val="ListParagraph"/>
         <w:numPr>
           <w:ilvl w:val="0"/>
-          <w:numId w:val="2"/>
+          <w:numId w:val="3"/>
         </w:numPr>
         <w:spacing w:before="0" w:after="80"/>
         <w:rPr/>
@@ -5477,7 +5477,7 @@
         <w:pStyle w:val="ListParagraph"/>
         <w:numPr>
           <w:ilvl w:val="0"/>
-          <w:numId w:val="2"/>
+          <w:numId w:val="3"/>
         </w:numPr>
         <w:spacing w:before="0" w:after="80"/>
         <w:rPr/>
@@ -5496,7 +5496,7 @@
         <w:pStyle w:val="ListParagraph"/>
         <w:numPr>
           <w:ilvl w:val="0"/>
-          <w:numId w:val="2"/>
+          <w:numId w:val="3"/>
         </w:numPr>
         <w:spacing w:before="0" w:after="80"/>
         <w:rPr/>
@@ -5535,7 +5535,7 @@
         <w:pStyle w:val="ListParagraph"/>
         <w:numPr>
           <w:ilvl w:val="0"/>
-          <w:numId w:val="2"/>
+          <w:numId w:val="3"/>
         </w:numPr>
         <w:spacing w:before="0" w:after="80"/>
         <w:rPr/>
@@ -5554,7 +5554,7 @@
         <w:pStyle w:val="ListParagraph"/>
         <w:numPr>
           <w:ilvl w:val="0"/>
-          <w:numId w:val="2"/>
+          <w:numId w:val="3"/>
         </w:numPr>
         <w:spacing w:before="0" w:after="80"/>
         <w:rPr/>
@@ -5573,7 +5573,7 @@
         <w:pStyle w:val="ListParagraph"/>
         <w:numPr>
           <w:ilvl w:val="0"/>
-          <w:numId w:val="2"/>
+          <w:numId w:val="3"/>
         </w:numPr>
         <w:spacing w:before="0" w:after="80"/>
         <w:rPr/>
@@ -6257,7 +6257,7 @@
         <w:pStyle w:val="ListParagraph"/>
         <w:numPr>
           <w:ilvl w:val="0"/>
-          <w:numId w:val="2"/>
+          <w:numId w:val="3"/>
         </w:numPr>
         <w:spacing w:before="0" w:after="80"/>
         <w:rPr/>
@@ -6276,7 +6276,7 @@
         <w:pStyle w:val="ListParagraph"/>
         <w:numPr>
           <w:ilvl w:val="0"/>
-          <w:numId w:val="2"/>
+          <w:numId w:val="3"/>
         </w:numPr>
         <w:spacing w:before="0" w:after="80"/>
         <w:rPr/>
@@ -6295,7 +6295,7 @@
         <w:pStyle w:val="ListParagraph"/>
         <w:numPr>
           <w:ilvl w:val="0"/>
-          <w:numId w:val="2"/>
+          <w:numId w:val="3"/>
         </w:numPr>
         <w:spacing w:before="0" w:after="80"/>
         <w:rPr/>
@@ -6314,7 +6314,7 @@
         <w:pStyle w:val="ListParagraph"/>
         <w:numPr>
           <w:ilvl w:val="0"/>
-          <w:numId w:val="2"/>
+          <w:numId w:val="3"/>
         </w:numPr>
         <w:spacing w:before="0" w:after="80"/>
         <w:rPr/>
@@ -7503,7 +7503,7 @@
         <w:pStyle w:val="ListParagraph"/>
         <w:numPr>
           <w:ilvl w:val="0"/>
-          <w:numId w:val="2"/>
+          <w:numId w:val="3"/>
         </w:numPr>
         <w:spacing w:before="0" w:after="80"/>
         <w:rPr/>
@@ -7522,7 +7522,7 @@
         <w:pStyle w:val="ListParagraph"/>
         <w:numPr>
           <w:ilvl w:val="0"/>
-          <w:numId w:val="2"/>
+          <w:numId w:val="3"/>
         </w:numPr>
         <w:spacing w:before="0" w:after="80"/>
         <w:rPr/>
@@ -7541,7 +7541,7 @@
         <w:pStyle w:val="ListParagraph"/>
         <w:numPr>
           <w:ilvl w:val="0"/>
-          <w:numId w:val="2"/>
+          <w:numId w:val="3"/>
         </w:numPr>
         <w:spacing w:before="0" w:after="80"/>
         <w:rPr/>
@@ -7560,7 +7560,7 @@
         <w:pStyle w:val="ListParagraph"/>
         <w:numPr>
           <w:ilvl w:val="0"/>
-          <w:numId w:val="2"/>
+          <w:numId w:val="3"/>
         </w:numPr>
         <w:spacing w:before="0" w:after="80"/>
         <w:rPr/>
@@ -7976,7 +7976,7 @@
         <w:pStyle w:val="ListParagraph"/>
         <w:numPr>
           <w:ilvl w:val="0"/>
-          <w:numId w:val="2"/>
+          <w:numId w:val="3"/>
         </w:numPr>
         <w:spacing w:before="0" w:after="80"/>
         <w:rPr/>
@@ -7995,7 +7995,7 @@
         <w:pStyle w:val="ListParagraph"/>
         <w:numPr>
           <w:ilvl w:val="0"/>
-          <w:numId w:val="2"/>
+          <w:numId w:val="3"/>
         </w:numPr>
         <w:spacing w:before="0" w:after="80"/>
         <w:rPr/>
@@ -8014,7 +8014,7 @@
         <w:pStyle w:val="ListParagraph"/>
         <w:numPr>
           <w:ilvl w:val="0"/>
-          <w:numId w:val="2"/>
+          <w:numId w:val="3"/>
         </w:numPr>
         <w:spacing w:before="0" w:after="80"/>
         <w:rPr/>
@@ -8033,7 +8033,7 @@
         <w:pStyle w:val="ListParagraph"/>
         <w:numPr>
           <w:ilvl w:val="0"/>
-          <w:numId w:val="2"/>
+          <w:numId w:val="3"/>
         </w:numPr>
         <w:spacing w:before="0" w:after="80"/>
         <w:rPr/>
@@ -8115,7 +8115,7 @@
         <w:pStyle w:val="ListParagraph"/>
         <w:numPr>
           <w:ilvl w:val="0"/>
-          <w:numId w:val="2"/>
+          <w:numId w:val="3"/>
         </w:numPr>
         <w:spacing w:before="0" w:after="80"/>
         <w:rPr/>
@@ -8134,7 +8134,7 @@
         <w:pStyle w:val="ListParagraph"/>
         <w:numPr>
           <w:ilvl w:val="0"/>
-          <w:numId w:val="2"/>
+          <w:numId w:val="3"/>
         </w:numPr>
         <w:spacing w:before="0" w:after="80"/>
         <w:rPr/>
@@ -8153,7 +8153,7 @@
         <w:pStyle w:val="ListParagraph"/>
         <w:numPr>
           <w:ilvl w:val="0"/>
-          <w:numId w:val="2"/>
+          <w:numId w:val="3"/>
         </w:numPr>
         <w:spacing w:before="0" w:after="80"/>
         <w:rPr/>
@@ -8172,7 +8172,7 @@
         <w:pStyle w:val="ListParagraph"/>
         <w:numPr>
           <w:ilvl w:val="0"/>
-          <w:numId w:val="2"/>
+          <w:numId w:val="3"/>
         </w:numPr>
         <w:spacing w:before="0" w:after="80"/>
         <w:rPr/>
@@ -8191,7 +8191,7 @@
         <w:pStyle w:val="ListParagraph"/>
         <w:numPr>
           <w:ilvl w:val="0"/>
-          <w:numId w:val="2"/>
+          <w:numId w:val="3"/>
         </w:numPr>
         <w:spacing w:before="0" w:after="80"/>
         <w:rPr/>
@@ -8210,7 +8210,7 @@
         <w:pStyle w:val="ListParagraph"/>
         <w:numPr>
           <w:ilvl w:val="0"/>
-          <w:numId w:val="2"/>
+          <w:numId w:val="3"/>
         </w:numPr>
         <w:spacing w:before="0" w:after="80"/>
         <w:rPr/>
@@ -8229,7 +8229,7 @@
         <w:pStyle w:val="ListParagraph"/>
         <w:numPr>
           <w:ilvl w:val="0"/>
-          <w:numId w:val="2"/>
+          <w:numId w:val="3"/>
         </w:numPr>
         <w:spacing w:before="0" w:after="80"/>
         <w:rPr/>
@@ -8248,7 +8248,7 @@
         <w:pStyle w:val="ListParagraph"/>
         <w:numPr>
           <w:ilvl w:val="0"/>
-          <w:numId w:val="2"/>
+          <w:numId w:val="3"/>
         </w:numPr>
         <w:spacing w:before="0" w:after="80"/>
         <w:rPr/>
@@ -8267,7 +8267,7 @@
         <w:pStyle w:val="ListParagraph"/>
         <w:numPr>
           <w:ilvl w:val="0"/>
-          <w:numId w:val="2"/>
+          <w:numId w:val="3"/>
         </w:numPr>
         <w:spacing w:before="0" w:after="80"/>
         <w:rPr/>
@@ -8286,7 +8286,7 @@
         <w:pStyle w:val="ListParagraph"/>
         <w:numPr>
           <w:ilvl w:val="0"/>
-          <w:numId w:val="2"/>
+          <w:numId w:val="3"/>
         </w:numPr>
         <w:spacing w:before="0" w:after="80"/>
         <w:rPr/>
@@ -8336,7 +8336,7 @@
         <w:pStyle w:val="ListParagraph"/>
         <w:numPr>
           <w:ilvl w:val="0"/>
-          <w:numId w:val="2"/>
+          <w:numId w:val="3"/>
         </w:numPr>
         <w:spacing w:before="0" w:after="80"/>
         <w:rPr/>
@@ -8355,7 +8355,7 @@
         <w:pStyle w:val="ListParagraph"/>
         <w:numPr>
           <w:ilvl w:val="0"/>
-          <w:numId w:val="2"/>
+          <w:numId w:val="3"/>
         </w:numPr>
         <w:spacing w:before="0" w:after="80"/>
         <w:rPr/>
@@ -8374,7 +8374,7 @@
         <w:pStyle w:val="ListParagraph"/>
         <w:numPr>
           <w:ilvl w:val="0"/>
-          <w:numId w:val="2"/>
+          <w:numId w:val="3"/>
         </w:numPr>
         <w:spacing w:before="0" w:after="80"/>
         <w:rPr/>
@@ -8393,7 +8393,7 @@
         <w:pStyle w:val="ListParagraph"/>
         <w:numPr>
           <w:ilvl w:val="0"/>
-          <w:numId w:val="2"/>
+          <w:numId w:val="3"/>
         </w:numPr>
         <w:spacing w:before="0" w:after="80"/>
         <w:rPr/>
@@ -8443,7 +8443,7 @@
         <w:pStyle w:val="ListParagraph"/>
         <w:numPr>
           <w:ilvl w:val="0"/>
-          <w:numId w:val="2"/>
+          <w:numId w:val="3"/>
         </w:numPr>
         <w:spacing w:before="0" w:after="80"/>
         <w:rPr/>
@@ -8462,7 +8462,7 @@
         <w:pStyle w:val="ListParagraph"/>
         <w:numPr>
           <w:ilvl w:val="0"/>
-          <w:numId w:val="2"/>
+          <w:numId w:val="3"/>
         </w:numPr>
         <w:spacing w:before="0" w:after="80"/>
         <w:rPr/>
@@ -8481,7 +8481,7 @@
         <w:pStyle w:val="ListParagraph"/>
         <w:numPr>
           <w:ilvl w:val="0"/>
-          <w:numId w:val="2"/>
+          <w:numId w:val="3"/>
         </w:numPr>
         <w:spacing w:before="0" w:after="80"/>
         <w:rPr/>
@@ -8500,7 +8500,7 @@
         <w:pStyle w:val="ListParagraph"/>
         <w:numPr>
           <w:ilvl w:val="0"/>
-          <w:numId w:val="2"/>
+          <w:numId w:val="3"/>
         </w:numPr>
         <w:spacing w:before="0" w:after="80"/>
         <w:rPr/>
@@ -9409,23 +9409,7 @@
           <w:sz w:val="22"/>
           <w:szCs w:val="22"/>
         </w:rPr>
-        <w:t>"</w:t>
-      </w:r>
-      <w:r>
-        <w:rPr>
-          <w:rFonts w:eastAsia="Arial" w:cs="Arial"/>
-          <w:sz w:val="22"/>
-          <w:szCs w:val="22"/>
-        </w:rPr>
-        <w:t xml:space="preserve">Faça um </w:t>
-      </w:r>
-      <w:r>
-        <w:rPr>
-          <w:rFonts w:eastAsia="Arial" w:cs="Arial"/>
-          <w:sz w:val="22"/>
-          <w:szCs w:val="22"/>
-        </w:rPr>
-        <w:t>Infográfico educativo vertical (proporção 9:16) no estilo roadmap, inspirado em materiais didáticos modernos. Estrada central em perspectiva. TEMA: [Título da Aula]. Cores sóbrias (azul, verde água, cinza). Ícones 2D limpos, mapas, gráficos simplificados, personagens minimalistas flat design."</w:t>
+        <w:t>"Faça um Infográfico educativo vertical (proporção 9:16) no estilo roadmap, inspirado em materiais didáticos modernos. Estrada central em perspectiva. TEMA: [Título da Aula]. Cores sóbrias (azul, verde água, cinza). Ícones 2D limpos, mapas, gráficos simplificados, personagens minimalistas flat design."</w:t>
       </w:r>
     </w:p>
     <w:p>
@@ -9469,7 +9453,7 @@
     </w:p>
     <w:p>
       <w:pPr>
-        <w:pStyle w:val="Blocodecitao"/>
+        <w:pStyle w:val="Blocodecitaouser"/>
         <w:spacing w:before="0" w:after="100"/>
         <w:rPr/>
       </w:pPr>
@@ -9486,7 +9470,7 @@
     </w:p>
     <w:p>
       <w:pPr>
-        <w:pStyle w:val="Blocodecitao"/>
+        <w:pStyle w:val="Blocodecitaouser"/>
         <w:spacing w:before="0" w:after="100"/>
         <w:rPr/>
       </w:pPr>
@@ -9502,7 +9486,7 @@
       </w:r>
       <w:r>
         <w:rPr>
-          <w:rStyle w:val="Cdigo-fonte"/>
+          <w:rStyle w:val="Cdigo-fonteuser"/>
         </w:rPr>
         <w:t>#f8f9fa</w:t>
       </w:r>
@@ -9513,7 +9497,7 @@
     </w:p>
     <w:p>
       <w:pPr>
-        <w:pStyle w:val="Blocodecitao"/>
+        <w:pStyle w:val="Blocodecitaouser"/>
         <w:spacing w:before="0" w:after="100"/>
         <w:rPr/>
       </w:pPr>
@@ -9529,7 +9513,7 @@
       </w:r>
       <w:r>
         <w:rPr>
-          <w:rStyle w:val="Cdigo-fonte"/>
+          <w:rStyle w:val="Cdigo-fonteuser"/>
         </w:rPr>
         <w:t>#ffffff</w:t>
       </w:r>
@@ -9539,7 +9523,7 @@
       </w:r>
       <w:r>
         <w:rPr>
-          <w:rStyle w:val="Cdigo-fonte"/>
+          <w:rStyle w:val="Cdigo-fonteuser"/>
         </w:rPr>
         <w:t>box-shadow: 0 4px 0 #1b5e20;</w:t>
       </w:r>
@@ -9550,7 +9534,7 @@
     </w:p>
     <w:p>
       <w:pPr>
-        <w:pStyle w:val="Blocodecitao"/>
+        <w:pStyle w:val="Blocodecitaouser"/>
         <w:spacing w:before="0" w:after="100"/>
         <w:rPr>
           <w:b/>
@@ -9565,17 +9549,17 @@
     </w:p>
     <w:p>
       <w:pPr>
-        <w:pStyle w:val="Blocodecitao"/>
+        <w:pStyle w:val="Blocodecitaouser"/>
         <w:numPr>
           <w:ilvl w:val="0"/>
-          <w:numId w:val="3"/>
+          <w:numId w:val="2"/>
         </w:numPr>
         <w:tabs>
           <w:tab w:val="clear" w:pos="720"/>
           <w:tab w:val="left" w:pos="0" w:leader="none"/>
         </w:tabs>
         <w:spacing w:before="0" w:after="100"/>
-        <w:ind w:hanging="283" w:start="1276"/>
+        <w:ind w:hanging="283" w:start="1276" w:end="567"/>
         <w:rPr/>
       </w:pPr>
       <w:r>
@@ -9584,7 +9568,7 @@
       </w:r>
       <w:r>
         <w:rPr>
-          <w:rStyle w:val="Cdigo-fonte"/>
+          <w:rStyle w:val="Cdigo-fonteuser"/>
         </w:rPr>
         <w:t>#2e7d32</w:t>
       </w:r>
@@ -9595,17 +9579,17 @@
     </w:p>
     <w:p>
       <w:pPr>
-        <w:pStyle w:val="Blocodecitao"/>
+        <w:pStyle w:val="Blocodecitaouser"/>
         <w:numPr>
           <w:ilvl w:val="0"/>
-          <w:numId w:val="3"/>
+          <w:numId w:val="2"/>
         </w:numPr>
         <w:tabs>
           <w:tab w:val="clear" w:pos="720"/>
           <w:tab w:val="left" w:pos="0" w:leader="none"/>
         </w:tabs>
         <w:spacing w:before="0" w:after="100"/>
-        <w:ind w:hanging="283" w:start="1276"/>
+        <w:ind w:hanging="283" w:start="1276" w:end="567"/>
         <w:rPr/>
       </w:pPr>
       <w:r>
@@ -9614,7 +9598,7 @@
       </w:r>
       <w:r>
         <w:rPr>
-          <w:rStyle w:val="Cdigo-fonte"/>
+          <w:rStyle w:val="Cdigo-fonteuser"/>
         </w:rPr>
         <w:t>#4caf50</w:t>
       </w:r>
@@ -9625,17 +9609,17 @@
     </w:p>
     <w:p>
       <w:pPr>
-        <w:pStyle w:val="Blocodecitao"/>
+        <w:pStyle w:val="Blocodecitaouser"/>
         <w:numPr>
           <w:ilvl w:val="0"/>
-          <w:numId w:val="3"/>
+          <w:numId w:val="2"/>
         </w:numPr>
         <w:tabs>
           <w:tab w:val="clear" w:pos="720"/>
           <w:tab w:val="left" w:pos="0" w:leader="none"/>
         </w:tabs>
         <w:spacing w:before="0" w:after="100"/>
-        <w:ind w:hanging="283" w:start="1276"/>
+        <w:ind w:hanging="283" w:start="1276" w:end="567"/>
         <w:rPr/>
       </w:pPr>
       <w:r>
@@ -9644,7 +9628,7 @@
       </w:r>
       <w:r>
         <w:rPr>
-          <w:rStyle w:val="Cdigo-fonte"/>
+          <w:rStyle w:val="Cdigo-fonteuser"/>
         </w:rPr>
         <w:t>#fbc02d</w:t>
       </w:r>
@@ -9655,7 +9639,7 @@
     </w:p>
     <w:p>
       <w:pPr>
-        <w:pStyle w:val="Blocodecitao"/>
+        <w:pStyle w:val="Blocodecitaouser"/>
         <w:spacing w:before="0" w:after="100"/>
         <w:rPr/>
       </w:pPr>
@@ -9672,7 +9656,7 @@
     </w:p>
     <w:p>
       <w:pPr>
-        <w:pStyle w:val="Blocodecitao"/>
+        <w:pStyle w:val="Blocodecitaouser"/>
         <w:spacing w:before="0" w:after="100"/>
         <w:rPr/>
       </w:pPr>
@@ -9689,7 +9673,7 @@
     </w:p>
     <w:p>
       <w:pPr>
-        <w:pStyle w:val="Blocodecitao"/>
+        <w:pStyle w:val="Blocodecitaouser"/>
         <w:spacing w:before="0" w:after="100"/>
         <w:rPr/>
       </w:pPr>
@@ -9888,7 +9872,15 @@
         </w:rPr>
       </w:pPr>
       <w:r>
-        <w:rPr/>
+        <w:rPr>
+          <w:rFonts w:ascii="Montserrat;sans-serif" w:hAnsi="Montserrat;sans-serif"/>
+          <w:b w:val="false"/>
+          <w:i w:val="false"/>
+          <w:caps w:val="false"/>
+          <w:smallCaps w:val="false"/>
+          <w:color w:val="2E7D32"/>
+          <w:spacing w:val="0"/>
+        </w:rPr>
       </w:r>
     </w:p>
     <w:sectPr>
@@ -10325,6 +10317,143 @@
       <w:lvlJc w:val="start"/>
       <w:pPr>
         <w:tabs>
+          <w:tab w:val="num" w:pos="709"/>
+        </w:tabs>
+        <w:ind w:start="709" w:hanging="283"/>
+      </w:pPr>
+      <w:rPr>
+        <w:rFonts w:ascii="Symbol" w:hAnsi="Symbol" w:cs="Symbol" w:hint="default"/>
+      </w:rPr>
+    </w:lvl>
+    <w:lvl w:ilvl="1">
+      <w:start w:val="1"/>
+      <w:numFmt w:val="bullet"/>
+      <w:lvlText w:val=""/>
+      <w:lvlJc w:val="start"/>
+      <w:pPr>
+        <w:tabs>
+          <w:tab w:val="num" w:pos="1418"/>
+        </w:tabs>
+        <w:ind w:start="1418" w:hanging="283"/>
+      </w:pPr>
+      <w:rPr>
+        <w:rFonts w:ascii="Symbol" w:hAnsi="Symbol" w:cs="Symbol" w:hint="default"/>
+      </w:rPr>
+    </w:lvl>
+    <w:lvl w:ilvl="2">
+      <w:start w:val="1"/>
+      <w:numFmt w:val="bullet"/>
+      <w:lvlText w:val=""/>
+      <w:lvlJc w:val="start"/>
+      <w:pPr>
+        <w:tabs>
+          <w:tab w:val="num" w:pos="2127"/>
+        </w:tabs>
+        <w:ind w:start="2127" w:hanging="283"/>
+      </w:pPr>
+      <w:rPr>
+        <w:rFonts w:ascii="Symbol" w:hAnsi="Symbol" w:cs="Symbol" w:hint="default"/>
+      </w:rPr>
+    </w:lvl>
+    <w:lvl w:ilvl="3">
+      <w:start w:val="1"/>
+      <w:numFmt w:val="bullet"/>
+      <w:lvlText w:val=""/>
+      <w:lvlJc w:val="start"/>
+      <w:pPr>
+        <w:tabs>
+          <w:tab w:val="num" w:pos="2836"/>
+        </w:tabs>
+        <w:ind w:start="2836" w:hanging="283"/>
+      </w:pPr>
+      <w:rPr>
+        <w:rFonts w:ascii="Symbol" w:hAnsi="Symbol" w:cs="Symbol" w:hint="default"/>
+      </w:rPr>
+    </w:lvl>
+    <w:lvl w:ilvl="4">
+      <w:start w:val="1"/>
+      <w:numFmt w:val="bullet"/>
+      <w:lvlText w:val=""/>
+      <w:lvlJc w:val="start"/>
+      <w:pPr>
+        <w:tabs>
+          <w:tab w:val="num" w:pos="3545"/>
+        </w:tabs>
+        <w:ind w:start="3545" w:hanging="283"/>
+      </w:pPr>
+      <w:rPr>
+        <w:rFonts w:ascii="Symbol" w:hAnsi="Symbol" w:cs="Symbol" w:hint="default"/>
+      </w:rPr>
+    </w:lvl>
+    <w:lvl w:ilvl="5">
+      <w:start w:val="1"/>
+      <w:numFmt w:val="bullet"/>
+      <w:lvlText w:val=""/>
+      <w:lvlJc w:val="start"/>
+      <w:pPr>
+        <w:tabs>
+          <w:tab w:val="num" w:pos="4254"/>
+        </w:tabs>
+        <w:ind w:start="4254" w:hanging="283"/>
+      </w:pPr>
+      <w:rPr>
+        <w:rFonts w:ascii="Symbol" w:hAnsi="Symbol" w:cs="Symbol" w:hint="default"/>
+      </w:rPr>
+    </w:lvl>
+    <w:lvl w:ilvl="6">
+      <w:start w:val="1"/>
+      <w:numFmt w:val="bullet"/>
+      <w:lvlText w:val=""/>
+      <w:lvlJc w:val="start"/>
+      <w:pPr>
+        <w:tabs>
+          <w:tab w:val="num" w:pos="4963"/>
+        </w:tabs>
+        <w:ind w:start="4963" w:hanging="283"/>
+      </w:pPr>
+      <w:rPr>
+        <w:rFonts w:ascii="Symbol" w:hAnsi="Symbol" w:cs="Symbol" w:hint="default"/>
+      </w:rPr>
+    </w:lvl>
+    <w:lvl w:ilvl="7">
+      <w:start w:val="1"/>
+      <w:numFmt w:val="bullet"/>
+      <w:lvlText w:val=""/>
+      <w:lvlJc w:val="start"/>
+      <w:pPr>
+        <w:tabs>
+          <w:tab w:val="num" w:pos="5672"/>
+        </w:tabs>
+        <w:ind w:start="5672" w:hanging="283"/>
+      </w:pPr>
+      <w:rPr>
+        <w:rFonts w:ascii="Symbol" w:hAnsi="Symbol" w:cs="Symbol" w:hint="default"/>
+      </w:rPr>
+    </w:lvl>
+    <w:lvl w:ilvl="8">
+      <w:start w:val="1"/>
+      <w:numFmt w:val="bullet"/>
+      <w:lvlText w:val=""/>
+      <w:lvlJc w:val="start"/>
+      <w:pPr>
+        <w:tabs>
+          <w:tab w:val="num" w:pos="6381"/>
+        </w:tabs>
+        <w:ind w:start="6381" w:hanging="283"/>
+      </w:pPr>
+      <w:rPr>
+        <w:rFonts w:ascii="Symbol" w:hAnsi="Symbol" w:cs="Symbol" w:hint="default"/>
+      </w:rPr>
+    </w:lvl>
+  </w:abstractNum>
+  <w:abstractNum w:abstractNumId="3">
+    <w:lvl w:ilvl="0">
+      <w:start w:val="1"/>
+      <w:numFmt w:val="bullet"/>
+      <w:lvlText w:val=""/>
+      <w:lvlJc w:val="start"/>
+      <w:pPr>
+        <w:tabs>
           <w:tab w:val="num" w:pos="0"/>
         </w:tabs>
         <w:ind w:start="720" w:hanging="360"/>
@@ -10436,143 +10565,6 @@
         <w:ind w:start="3600" w:hanging="360"/>
       </w:pPr>
       <w:rPr/>
-    </w:lvl>
-  </w:abstractNum>
-  <w:abstractNum w:abstractNumId="3">
-    <w:lvl w:ilvl="0">
-      <w:start w:val="1"/>
-      <w:numFmt w:val="bullet"/>
-      <w:lvlText w:val=""/>
-      <w:lvlJc w:val="start"/>
-      <w:pPr>
-        <w:tabs>
-          <w:tab w:val="num" w:pos="709"/>
-        </w:tabs>
-        <w:ind w:start="709" w:hanging="283"/>
-      </w:pPr>
-      <w:rPr>
-        <w:rFonts w:ascii="Symbol" w:hAnsi="Symbol" w:cs="Symbol" w:hint="default"/>
-      </w:rPr>
-    </w:lvl>
-    <w:lvl w:ilvl="1">
-      <w:start w:val="1"/>
-      <w:numFmt w:val="bullet"/>
-      <w:lvlText w:val=""/>
-      <w:lvlJc w:val="start"/>
-      <w:pPr>
-        <w:tabs>
-          <w:tab w:val="num" w:pos="1418"/>
-        </w:tabs>
-        <w:ind w:start="1418" w:hanging="283"/>
-      </w:pPr>
-      <w:rPr>
-        <w:rFonts w:ascii="Symbol" w:hAnsi="Symbol" w:cs="Symbol" w:hint="default"/>
-      </w:rPr>
-    </w:lvl>
-    <w:lvl w:ilvl="2">
-      <w:start w:val="1"/>
-      <w:numFmt w:val="bullet"/>
-      <w:lvlText w:val=""/>
-      <w:lvlJc w:val="start"/>
-      <w:pPr>
-        <w:tabs>
-          <w:tab w:val="num" w:pos="2127"/>
-        </w:tabs>
-        <w:ind w:start="2127" w:hanging="283"/>
-      </w:pPr>
-      <w:rPr>
-        <w:rFonts w:ascii="Symbol" w:hAnsi="Symbol" w:cs="Symbol" w:hint="default"/>
-      </w:rPr>
-    </w:lvl>
-    <w:lvl w:ilvl="3">
-      <w:start w:val="1"/>
-      <w:numFmt w:val="bullet"/>
-      <w:lvlText w:val=""/>
-      <w:lvlJc w:val="start"/>
-      <w:pPr>
-        <w:tabs>
-          <w:tab w:val="num" w:pos="2836"/>
-        </w:tabs>
-        <w:ind w:start="2836" w:hanging="283"/>
-      </w:pPr>
-      <w:rPr>
-        <w:rFonts w:ascii="Symbol" w:hAnsi="Symbol" w:cs="Symbol" w:hint="default"/>
-      </w:rPr>
-    </w:lvl>
-    <w:lvl w:ilvl="4">
-      <w:start w:val="1"/>
-      <w:numFmt w:val="bullet"/>
-      <w:lvlText w:val=""/>
-      <w:lvlJc w:val="start"/>
-      <w:pPr>
-        <w:tabs>
-          <w:tab w:val="num" w:pos="3545"/>
-        </w:tabs>
-        <w:ind w:start="3545" w:hanging="283"/>
-      </w:pPr>
-      <w:rPr>
-        <w:rFonts w:ascii="Symbol" w:hAnsi="Symbol" w:cs="Symbol" w:hint="default"/>
-      </w:rPr>
-    </w:lvl>
-    <w:lvl w:ilvl="5">
-      <w:start w:val="1"/>
-      <w:numFmt w:val="bullet"/>
-      <w:lvlText w:val=""/>
-      <w:lvlJc w:val="start"/>
-      <w:pPr>
-        <w:tabs>
-          <w:tab w:val="num" w:pos="4254"/>
-        </w:tabs>
-        <w:ind w:start="4254" w:hanging="283"/>
-      </w:pPr>
-      <w:rPr>
-        <w:rFonts w:ascii="Symbol" w:hAnsi="Symbol" w:cs="Symbol" w:hint="default"/>
-      </w:rPr>
-    </w:lvl>
-    <w:lvl w:ilvl="6">
-      <w:start w:val="1"/>
-      <w:numFmt w:val="bullet"/>
-      <w:lvlText w:val=""/>
-      <w:lvlJc w:val="start"/>
-      <w:pPr>
-        <w:tabs>
-          <w:tab w:val="num" w:pos="4963"/>
-        </w:tabs>
-        <w:ind w:start="4963" w:hanging="283"/>
-      </w:pPr>
-      <w:rPr>
-        <w:rFonts w:ascii="Symbol" w:hAnsi="Symbol" w:cs="Symbol" w:hint="default"/>
-      </w:rPr>
-    </w:lvl>
-    <w:lvl w:ilvl="7">
-      <w:start w:val="1"/>
-      <w:numFmt w:val="bullet"/>
-      <w:lvlText w:val=""/>
-      <w:lvlJc w:val="start"/>
-      <w:pPr>
-        <w:tabs>
-          <w:tab w:val="num" w:pos="5672"/>
-        </w:tabs>
-        <w:ind w:start="5672" w:hanging="283"/>
-      </w:pPr>
-      <w:rPr>
-        <w:rFonts w:ascii="Symbol" w:hAnsi="Symbol" w:cs="Symbol" w:hint="default"/>
-      </w:rPr>
-    </w:lvl>
-    <w:lvl w:ilvl="8">
-      <w:start w:val="1"/>
-      <w:numFmt w:val="bullet"/>
-      <w:lvlText w:val=""/>
-      <w:lvlJc w:val="start"/>
-      <w:pPr>
-        <w:tabs>
-          <w:tab w:val="num" w:pos="6381"/>
-        </w:tabs>
-        <w:ind w:start="6381" w:hanging="283"/>
-      </w:pPr>
-      <w:rPr>
-        <w:rFonts w:ascii="Symbol" w:hAnsi="Symbol" w:cs="Symbol" w:hint="default"/>
-      </w:rPr>
     </w:lvl>
   </w:abstractNum>
   <w:abstractNum w:abstractNumId="4">
@@ -10707,7 +10699,7 @@
     <w:abstractNumId w:val="4"/>
   </w:num>
   <w:num w:numId="5">
-    <w:abstractNumId w:val="2"/>
+    <w:abstractNumId w:val="3"/>
     <w:lvlOverride w:ilvl="0">
       <w:startOverride w:val="1"/>
     </w:lvlOverride>
@@ -10753,7 +10745,7 @@
   </w:style>
   <w:style w:type="paragraph" w:styleId="Heading1">
     <w:name w:val="heading 1"/>
-    <w:basedOn w:val="Ttulouser"/>
+    <w:basedOn w:val="Ttulo"/>
     <w:qFormat/>
     <w:pPr>
       <w:spacing w:before="320" w:after="160"/>
@@ -10770,7 +10762,7 @@
   </w:style>
   <w:style w:type="paragraph" w:styleId="Heading2">
     <w:name w:val="heading 2"/>
-    <w:basedOn w:val="Ttulouser"/>
+    <w:basedOn w:val="Ttulo"/>
     <w:qFormat/>
     <w:pPr>
       <w:spacing w:before="240" w:after="120"/>
@@ -10787,7 +10779,7 @@
   </w:style>
   <w:style w:type="paragraph" w:styleId="Heading3">
     <w:name w:val="heading 3"/>
-    <w:basedOn w:val="Ttulouser"/>
+    <w:basedOn w:val="Ttulo"/>
     <w:qFormat/>
     <w:pPr/>
     <w:rPr>
@@ -10798,7 +10790,7 @@
   </w:style>
   <w:style w:type="paragraph" w:styleId="Heading4">
     <w:name w:val="heading 4"/>
-    <w:basedOn w:val="Ttulouser"/>
+    <w:basedOn w:val="Ttulo"/>
     <w:qFormat/>
     <w:pPr/>
     <w:rPr>
@@ -10809,7 +10801,7 @@
   </w:style>
   <w:style w:type="paragraph" w:styleId="Heading5">
     <w:name w:val="heading 5"/>
-    <w:basedOn w:val="Ttulouser"/>
+    <w:basedOn w:val="Ttulo"/>
     <w:qFormat/>
     <w:pPr/>
     <w:rPr>
@@ -10818,7 +10810,7 @@
   </w:style>
   <w:style w:type="paragraph" w:styleId="Heading6">
     <w:name w:val="heading 6"/>
-    <w:basedOn w:val="Ttulouser"/>
+    <w:basedOn w:val="Ttulo"/>
     <w:qFormat/>
     <w:pPr/>
     <w:rPr>
@@ -10834,8 +10826,8 @@
       <w:u w:val="single"/>
     </w:rPr>
   </w:style>
-  <w:style w:type="character" w:styleId="Caracteresdenotaderodapuser">
-    <w:name w:val="Caracteres de nota de rodapé (user)"/>
+  <w:style w:type="character" w:styleId="Caracteresdenotaderodap">
+    <w:name w:val="Caracteres de nota de rodapé"/>
     <w:uiPriority w:val="99"/>
     <w:semiHidden/>
     <w:unhideWhenUsed/>
@@ -10844,8 +10836,8 @@
       <w:vertAlign w:val="superscript"/>
     </w:rPr>
   </w:style>
-  <w:style w:type="character" w:styleId="Caracteresdenotaderodap">
-    <w:name w:val="Caracteres de nota de rodapé"/>
+  <w:style w:type="character" w:styleId="Caracteresdenotaderodapuser">
+    <w:name w:val="Caracteres de nota de rodapé (user)"/>
     <w:qFormat/>
     <w:rPr>
       <w:vertAlign w:val="superscript"/>
@@ -10868,8 +10860,8 @@
       <w:szCs w:val="20"/>
     </w:rPr>
   </w:style>
-  <w:style w:type="character" w:styleId="Caracteresdenotadefimuser">
-    <w:name w:val="Caracteres de nota de fim (user)"/>
+  <w:style w:type="character" w:styleId="Caracteresdenotadefim">
+    <w:name w:val="Caracteres de nota de fim"/>
     <w:uiPriority w:val="99"/>
     <w:semiHidden/>
     <w:unhideWhenUsed/>
@@ -10878,8 +10870,8 @@
       <w:vertAlign w:val="superscript"/>
     </w:rPr>
   </w:style>
-  <w:style w:type="character" w:styleId="Caracteresdenotadefim">
-    <w:name w:val="Caracteres de nota de fim"/>
+  <w:style w:type="character" w:styleId="Caracteresdenotadefimuser">
+    <w:name w:val="Caracteres de nota de fim (user)"/>
     <w:qFormat/>
     <w:rPr>
       <w:vertAlign w:val="superscript"/>
@@ -10902,25 +10894,25 @@
       <w:szCs w:val="20"/>
     </w:rPr>
   </w:style>
+  <w:style w:type="character" w:styleId="Vnculodendice">
+    <w:name w:val="Vínculo de índice"/>
+    <w:qFormat/>
+    <w:rPr/>
+  </w:style>
   <w:style w:type="character" w:styleId="Vnculodendiceuser">
     <w:name w:val="Vínculo de índice (user)"/>
     <w:qFormat/>
     <w:rPr/>
   </w:style>
-  <w:style w:type="character" w:styleId="Vnculodendice">
-    <w:name w:val="Vínculo de índice"/>
-    <w:qFormat/>
-    <w:rPr/>
-  </w:style>
-  <w:style w:type="character" w:styleId="Cdigo-fonte">
-    <w:name w:val="Código-fonte"/>
+  <w:style w:type="character" w:styleId="Cdigo-fonteuser">
+    <w:name w:val="Código-fonte (user)"/>
     <w:qFormat/>
     <w:rPr>
       <w:rFonts w:ascii="Liberation Mono" w:hAnsi="Liberation Mono" w:eastAsia="NSimSun" w:cs="Liberation Mono"/>
     </w:rPr>
   </w:style>
-  <w:style w:type="character" w:styleId="Marcadores">
-    <w:name w:val="Marcadores"/>
+  <w:style w:type="character" w:styleId="Marcadoresuser">
+    <w:name w:val="Marcadores (user)"/>
     <w:qFormat/>
     <w:rPr>
       <w:rFonts w:ascii="OpenSymbol" w:hAnsi="OpenSymbol" w:eastAsia="OpenSymbol" w:cs="OpenSymbol"/>
@@ -11012,7 +11004,7 @@
   </w:style>
   <w:style w:type="paragraph" w:styleId="Title">
     <w:name w:val="Title"/>
-    <w:basedOn w:val="Ttulouser"/>
+    <w:basedOn w:val="Ttulo"/>
     <w:qFormat/>
     <w:pPr/>
     <w:rPr>
@@ -11090,6 +11082,13 @@
       <w:szCs w:val="20"/>
     </w:rPr>
   </w:style>
+  <w:style w:type="paragraph" w:styleId="Cabealhoerodap">
+    <w:name w:val="Cabeçalho e rodapé"/>
+    <w:basedOn w:val="Normal"/>
+    <w:qFormat/>
+    <w:pPr/>
+    <w:rPr/>
+  </w:style>
   <w:style w:type="paragraph" w:styleId="Cabealhoerodapuser">
     <w:name w:val="Cabeçalho e rodapé (user)"/>
     <w:basedOn w:val="Normal"/>
@@ -11097,28 +11096,21 @@
     <w:pPr/>
     <w:rPr/>
   </w:style>
-  <w:style w:type="paragraph" w:styleId="Cabealhoerodap">
-    <w:name w:val="Cabeçalho e rodapé"/>
-    <w:basedOn w:val="Normal"/>
-    <w:qFormat/>
-    <w:pPr/>
-    <w:rPr/>
-  </w:style>
   <w:style w:type="paragraph" w:styleId="Header">
     <w:name w:val="header"/>
-    <w:basedOn w:val="Cabealhoerodapuser"/>
+    <w:basedOn w:val="Cabealhoerodap"/>
     <w:pPr/>
     <w:rPr/>
   </w:style>
   <w:style w:type="paragraph" w:styleId="Footer">
     <w:name w:val="footer"/>
-    <w:basedOn w:val="Cabealhoerodapuser"/>
+    <w:basedOn w:val="Cabealhoerodap"/>
     <w:pPr/>
     <w:rPr/>
   </w:style>
   <w:style w:type="paragraph" w:styleId="IndexHeading">
     <w:name w:val="index heading"/>
-    <w:basedOn w:val="Ttulouser"/>
+    <w:basedOn w:val="Ttulo"/>
     <w:pPr>
       <w:suppressLineNumbers/>
       <w:ind w:hanging="0" w:start="0"/>
@@ -11147,7 +11139,7 @@
   </w:style>
   <w:style w:type="paragraph" w:styleId="TOC1">
     <w:name w:val="toc 1"/>
-    <w:basedOn w:val="ndiceuser"/>
+    <w:basedOn w:val="ndice"/>
     <w:pPr>
       <w:tabs>
         <w:tab w:val="clear" w:pos="720"/>
@@ -11159,7 +11151,7 @@
   </w:style>
   <w:style w:type="paragraph" w:styleId="TOC2">
     <w:name w:val="toc 2"/>
-    <w:basedOn w:val="ndiceuser"/>
+    <w:basedOn w:val="ndice"/>
     <w:pPr>
       <w:tabs>
         <w:tab w:val="clear" w:pos="720"/>
@@ -11169,8 +11161,8 @@
     </w:pPr>
     <w:rPr/>
   </w:style>
-  <w:style w:type="paragraph" w:styleId="Blocodecitao">
-    <w:name w:val="Bloco de citação"/>
+  <w:style w:type="paragraph" w:styleId="Blocodecitaouser">
+    <w:name w:val="Bloco de citação (user)"/>
     <w:basedOn w:val="Normal"/>
     <w:qFormat/>
     <w:pPr>

</xml_diff>

<commit_message>
texto 27 1 ano
</commit_message>
<xml_diff>
--- a/docs/DocumentacaoSite.docx
+++ b/docs/DocumentacaoSite.docx
@@ -1406,14 +1406,14 @@
         </w:tblCellMar>
       </w:tblPr>
       <w:tblGrid>
-        <w:gridCol w:w="2195"/>
-        <w:gridCol w:w="7165"/>
+        <w:gridCol w:w="2194"/>
+        <w:gridCol w:w="7166"/>
       </w:tblGrid>
       <w:tr>
         <w:trPr/>
         <w:tc>
           <w:tcPr>
-            <w:tcW w:w="2195" w:type="dxa"/>
+            <w:tcW w:w="2194" w:type="dxa"/>
             <w:tcBorders>
               <w:top w:val="single" w:sz="2" w:space="0" w:color="CCCCCC"/>
               <w:start w:val="single" w:sz="2" w:space="0" w:color="CCCCCC"/>
@@ -1441,7 +1441,7 @@
         </w:tc>
         <w:tc>
           <w:tcPr>
-            <w:tcW w:w="7165" w:type="dxa"/>
+            <w:tcW w:w="7166" w:type="dxa"/>
             <w:tcBorders>
               <w:top w:val="single" w:sz="2" w:space="0" w:color="CCCCCC"/>
               <w:start w:val="single" w:sz="2" w:space="0" w:color="CCCCCC"/>
@@ -1472,7 +1472,7 @@
         <w:trPr/>
         <w:tc>
           <w:tcPr>
-            <w:tcW w:w="2195" w:type="dxa"/>
+            <w:tcW w:w="2194" w:type="dxa"/>
             <w:tcBorders>
               <w:top w:val="single" w:sz="2" w:space="0" w:color="CCCCCC"/>
               <w:start w:val="single" w:sz="2" w:space="0" w:color="CCCCCC"/>
@@ -1500,7 +1500,7 @@
         </w:tc>
         <w:tc>
           <w:tcPr>
-            <w:tcW w:w="7165" w:type="dxa"/>
+            <w:tcW w:w="7166" w:type="dxa"/>
             <w:tcBorders>
               <w:top w:val="single" w:sz="2" w:space="0" w:color="CCCCCC"/>
               <w:start w:val="single" w:sz="2" w:space="0" w:color="CCCCCC"/>
@@ -1529,7 +1529,7 @@
         <w:trPr/>
         <w:tc>
           <w:tcPr>
-            <w:tcW w:w="2195" w:type="dxa"/>
+            <w:tcW w:w="2194" w:type="dxa"/>
             <w:tcBorders>
               <w:top w:val="single" w:sz="2" w:space="0" w:color="CCCCCC"/>
               <w:start w:val="single" w:sz="2" w:space="0" w:color="CCCCCC"/>
@@ -1557,7 +1557,7 @@
         </w:tc>
         <w:tc>
           <w:tcPr>
-            <w:tcW w:w="7165" w:type="dxa"/>
+            <w:tcW w:w="7166" w:type="dxa"/>
             <w:tcBorders>
               <w:top w:val="single" w:sz="2" w:space="0" w:color="CCCCCC"/>
               <w:start w:val="single" w:sz="2" w:space="0" w:color="CCCCCC"/>
@@ -1586,7 +1586,7 @@
         <w:trPr/>
         <w:tc>
           <w:tcPr>
-            <w:tcW w:w="2195" w:type="dxa"/>
+            <w:tcW w:w="2194" w:type="dxa"/>
             <w:tcBorders>
               <w:top w:val="single" w:sz="2" w:space="0" w:color="CCCCCC"/>
               <w:start w:val="single" w:sz="2" w:space="0" w:color="CCCCCC"/>
@@ -1614,7 +1614,7 @@
         </w:tc>
         <w:tc>
           <w:tcPr>
-            <w:tcW w:w="7165" w:type="dxa"/>
+            <w:tcW w:w="7166" w:type="dxa"/>
             <w:tcBorders>
               <w:top w:val="single" w:sz="2" w:space="0" w:color="CCCCCC"/>
               <w:start w:val="single" w:sz="2" w:space="0" w:color="CCCCCC"/>
@@ -1643,7 +1643,7 @@
         <w:trPr/>
         <w:tc>
           <w:tcPr>
-            <w:tcW w:w="2195" w:type="dxa"/>
+            <w:tcW w:w="2194" w:type="dxa"/>
             <w:tcBorders>
               <w:top w:val="single" w:sz="2" w:space="0" w:color="CCCCCC"/>
               <w:start w:val="single" w:sz="2" w:space="0" w:color="CCCCCC"/>
@@ -1671,7 +1671,7 @@
         </w:tc>
         <w:tc>
           <w:tcPr>
-            <w:tcW w:w="7165" w:type="dxa"/>
+            <w:tcW w:w="7166" w:type="dxa"/>
             <w:tcBorders>
               <w:top w:val="single" w:sz="2" w:space="0" w:color="CCCCCC"/>
               <w:start w:val="single" w:sz="2" w:space="0" w:color="CCCCCC"/>
@@ -1700,7 +1700,7 @@
         <w:trPr/>
         <w:tc>
           <w:tcPr>
-            <w:tcW w:w="2195" w:type="dxa"/>
+            <w:tcW w:w="2194" w:type="dxa"/>
             <w:tcBorders>
               <w:top w:val="single" w:sz="2" w:space="0" w:color="CCCCCC"/>
               <w:start w:val="single" w:sz="2" w:space="0" w:color="CCCCCC"/>
@@ -1728,7 +1728,7 @@
         </w:tc>
         <w:tc>
           <w:tcPr>
-            <w:tcW w:w="7165" w:type="dxa"/>
+            <w:tcW w:w="7166" w:type="dxa"/>
             <w:tcBorders>
               <w:top w:val="single" w:sz="2" w:space="0" w:color="CCCCCC"/>
               <w:start w:val="single" w:sz="2" w:space="0" w:color="CCCCCC"/>
@@ -1757,7 +1757,7 @@
         <w:trPr/>
         <w:tc>
           <w:tcPr>
-            <w:tcW w:w="2195" w:type="dxa"/>
+            <w:tcW w:w="2194" w:type="dxa"/>
             <w:tcBorders>
               <w:top w:val="single" w:sz="2" w:space="0" w:color="CCCCCC"/>
               <w:start w:val="single" w:sz="2" w:space="0" w:color="CCCCCC"/>
@@ -1785,7 +1785,7 @@
         </w:tc>
         <w:tc>
           <w:tcPr>
-            <w:tcW w:w="7165" w:type="dxa"/>
+            <w:tcW w:w="7166" w:type="dxa"/>
             <w:tcBorders>
               <w:top w:val="single" w:sz="2" w:space="0" w:color="CCCCCC"/>
               <w:start w:val="single" w:sz="2" w:space="0" w:color="CCCCCC"/>
@@ -1814,7 +1814,7 @@
         <w:trPr/>
         <w:tc>
           <w:tcPr>
-            <w:tcW w:w="2195" w:type="dxa"/>
+            <w:tcW w:w="2194" w:type="dxa"/>
             <w:tcBorders>
               <w:top w:val="single" w:sz="2" w:space="0" w:color="CCCCCC"/>
               <w:start w:val="single" w:sz="2" w:space="0" w:color="CCCCCC"/>
@@ -1842,7 +1842,7 @@
         </w:tc>
         <w:tc>
           <w:tcPr>
-            <w:tcW w:w="7165" w:type="dxa"/>
+            <w:tcW w:w="7166" w:type="dxa"/>
             <w:tcBorders>
               <w:top w:val="single" w:sz="2" w:space="0" w:color="CCCCCC"/>
               <w:start w:val="single" w:sz="2" w:space="0" w:color="CCCCCC"/>
@@ -1871,7 +1871,7 @@
         <w:trPr/>
         <w:tc>
           <w:tcPr>
-            <w:tcW w:w="2195" w:type="dxa"/>
+            <w:tcW w:w="2194" w:type="dxa"/>
             <w:tcBorders>
               <w:top w:val="single" w:sz="2" w:space="0" w:color="CCCCCC"/>
               <w:start w:val="single" w:sz="2" w:space="0" w:color="CCCCCC"/>
@@ -1899,7 +1899,7 @@
         </w:tc>
         <w:tc>
           <w:tcPr>
-            <w:tcW w:w="7165" w:type="dxa"/>
+            <w:tcW w:w="7166" w:type="dxa"/>
             <w:tcBorders>
               <w:top w:val="single" w:sz="2" w:space="0" w:color="CCCCCC"/>
               <w:start w:val="single" w:sz="2" w:space="0" w:color="CCCCCC"/>
@@ -9453,7 +9453,7 @@
     </w:p>
     <w:p>
       <w:pPr>
-        <w:pStyle w:val="Blocodecitaouser"/>
+        <w:pStyle w:val="Blocodecitao"/>
         <w:spacing w:before="0" w:after="100"/>
         <w:rPr/>
       </w:pPr>
@@ -9470,7 +9470,7 @@
     </w:p>
     <w:p>
       <w:pPr>
-        <w:pStyle w:val="Blocodecitaouser"/>
+        <w:pStyle w:val="Blocodecitao"/>
         <w:spacing w:before="0" w:after="100"/>
         <w:rPr/>
       </w:pPr>
@@ -9486,7 +9486,7 @@
       </w:r>
       <w:r>
         <w:rPr>
-          <w:rStyle w:val="Cdigo-fonteuser"/>
+          <w:rStyle w:val="Cdigo-fonte"/>
         </w:rPr>
         <w:t>#f8f9fa</w:t>
       </w:r>
@@ -9497,7 +9497,7 @@
     </w:p>
     <w:p>
       <w:pPr>
-        <w:pStyle w:val="Blocodecitaouser"/>
+        <w:pStyle w:val="Blocodecitao"/>
         <w:spacing w:before="0" w:after="100"/>
         <w:rPr/>
       </w:pPr>
@@ -9513,7 +9513,7 @@
       </w:r>
       <w:r>
         <w:rPr>
-          <w:rStyle w:val="Cdigo-fonteuser"/>
+          <w:rStyle w:val="Cdigo-fonte"/>
         </w:rPr>
         <w:t>#ffffff</w:t>
       </w:r>
@@ -9523,7 +9523,7 @@
       </w:r>
       <w:r>
         <w:rPr>
-          <w:rStyle w:val="Cdigo-fonteuser"/>
+          <w:rStyle w:val="Cdigo-fonte"/>
         </w:rPr>
         <w:t>box-shadow: 0 4px 0 #1b5e20;</w:t>
       </w:r>
@@ -9534,7 +9534,7 @@
     </w:p>
     <w:p>
       <w:pPr>
-        <w:pStyle w:val="Blocodecitaouser"/>
+        <w:pStyle w:val="Blocodecitao"/>
         <w:spacing w:before="0" w:after="100"/>
         <w:rPr>
           <w:b/>
@@ -9549,10 +9549,10 @@
     </w:p>
     <w:p>
       <w:pPr>
-        <w:pStyle w:val="Blocodecitaouser"/>
+        <w:pStyle w:val="Blocodecitao"/>
         <w:numPr>
           <w:ilvl w:val="0"/>
-          <w:numId w:val="2"/>
+          <w:numId w:val="1"/>
         </w:numPr>
         <w:tabs>
           <w:tab w:val="clear" w:pos="720"/>
@@ -9568,7 +9568,7 @@
       </w:r>
       <w:r>
         <w:rPr>
-          <w:rStyle w:val="Cdigo-fonteuser"/>
+          <w:rStyle w:val="Cdigo-fonte"/>
         </w:rPr>
         <w:t>#2e7d32</w:t>
       </w:r>
@@ -9579,10 +9579,10 @@
     </w:p>
     <w:p>
       <w:pPr>
-        <w:pStyle w:val="Blocodecitaouser"/>
+        <w:pStyle w:val="Blocodecitao"/>
         <w:numPr>
           <w:ilvl w:val="0"/>
-          <w:numId w:val="2"/>
+          <w:numId w:val="1"/>
         </w:numPr>
         <w:tabs>
           <w:tab w:val="clear" w:pos="720"/>
@@ -9598,7 +9598,7 @@
       </w:r>
       <w:r>
         <w:rPr>
-          <w:rStyle w:val="Cdigo-fonteuser"/>
+          <w:rStyle w:val="Cdigo-fonte"/>
         </w:rPr>
         <w:t>#4caf50</w:t>
       </w:r>
@@ -9609,10 +9609,10 @@
     </w:p>
     <w:p>
       <w:pPr>
-        <w:pStyle w:val="Blocodecitaouser"/>
+        <w:pStyle w:val="Blocodecitao"/>
         <w:numPr>
           <w:ilvl w:val="0"/>
-          <w:numId w:val="2"/>
+          <w:numId w:val="1"/>
         </w:numPr>
         <w:tabs>
           <w:tab w:val="clear" w:pos="720"/>
@@ -9628,7 +9628,7 @@
       </w:r>
       <w:r>
         <w:rPr>
-          <w:rStyle w:val="Cdigo-fonteuser"/>
+          <w:rStyle w:val="Cdigo-fonte"/>
         </w:rPr>
         <w:t>#fbc02d</w:t>
       </w:r>
@@ -9639,7 +9639,7 @@
     </w:p>
     <w:p>
       <w:pPr>
-        <w:pStyle w:val="Blocodecitaouser"/>
+        <w:pStyle w:val="Blocodecitao"/>
         <w:spacing w:before="0" w:after="100"/>
         <w:rPr/>
       </w:pPr>
@@ -9656,7 +9656,7 @@
     </w:p>
     <w:p>
       <w:pPr>
-        <w:pStyle w:val="Blocodecitaouser"/>
+        <w:pStyle w:val="Blocodecitao"/>
         <w:spacing w:before="0" w:after="100"/>
         <w:rPr/>
       </w:pPr>
@@ -9673,7 +9673,7 @@
     </w:p>
     <w:p>
       <w:pPr>
-        <w:pStyle w:val="Blocodecitaouser"/>
+        <w:pStyle w:val="Blocodecitao"/>
         <w:spacing w:before="0" w:after="100"/>
         <w:rPr/>
       </w:pPr>
@@ -10196,6 +10196,143 @@
       <w:lvlJc w:val="start"/>
       <w:pPr>
         <w:tabs>
+          <w:tab w:val="num" w:pos="709"/>
+        </w:tabs>
+        <w:ind w:start="709" w:hanging="283"/>
+      </w:pPr>
+      <w:rPr>
+        <w:rFonts w:ascii="Symbol" w:hAnsi="Symbol" w:cs="Symbol" w:hint="default"/>
+      </w:rPr>
+    </w:lvl>
+    <w:lvl w:ilvl="1">
+      <w:start w:val="1"/>
+      <w:numFmt w:val="bullet"/>
+      <w:lvlText w:val=""/>
+      <w:lvlJc w:val="start"/>
+      <w:pPr>
+        <w:tabs>
+          <w:tab w:val="num" w:pos="1418"/>
+        </w:tabs>
+        <w:ind w:start="1418" w:hanging="283"/>
+      </w:pPr>
+      <w:rPr>
+        <w:rFonts w:ascii="Symbol" w:hAnsi="Symbol" w:cs="Symbol" w:hint="default"/>
+      </w:rPr>
+    </w:lvl>
+    <w:lvl w:ilvl="2">
+      <w:start w:val="1"/>
+      <w:numFmt w:val="bullet"/>
+      <w:lvlText w:val=""/>
+      <w:lvlJc w:val="start"/>
+      <w:pPr>
+        <w:tabs>
+          <w:tab w:val="num" w:pos="2127"/>
+        </w:tabs>
+        <w:ind w:start="2127" w:hanging="283"/>
+      </w:pPr>
+      <w:rPr>
+        <w:rFonts w:ascii="Symbol" w:hAnsi="Symbol" w:cs="Symbol" w:hint="default"/>
+      </w:rPr>
+    </w:lvl>
+    <w:lvl w:ilvl="3">
+      <w:start w:val="1"/>
+      <w:numFmt w:val="bullet"/>
+      <w:lvlText w:val=""/>
+      <w:lvlJc w:val="start"/>
+      <w:pPr>
+        <w:tabs>
+          <w:tab w:val="num" w:pos="2836"/>
+        </w:tabs>
+        <w:ind w:start="2836" w:hanging="283"/>
+      </w:pPr>
+      <w:rPr>
+        <w:rFonts w:ascii="Symbol" w:hAnsi="Symbol" w:cs="Symbol" w:hint="default"/>
+      </w:rPr>
+    </w:lvl>
+    <w:lvl w:ilvl="4">
+      <w:start w:val="1"/>
+      <w:numFmt w:val="bullet"/>
+      <w:lvlText w:val=""/>
+      <w:lvlJc w:val="start"/>
+      <w:pPr>
+        <w:tabs>
+          <w:tab w:val="num" w:pos="3545"/>
+        </w:tabs>
+        <w:ind w:start="3545" w:hanging="283"/>
+      </w:pPr>
+      <w:rPr>
+        <w:rFonts w:ascii="Symbol" w:hAnsi="Symbol" w:cs="Symbol" w:hint="default"/>
+      </w:rPr>
+    </w:lvl>
+    <w:lvl w:ilvl="5">
+      <w:start w:val="1"/>
+      <w:numFmt w:val="bullet"/>
+      <w:lvlText w:val=""/>
+      <w:lvlJc w:val="start"/>
+      <w:pPr>
+        <w:tabs>
+          <w:tab w:val="num" w:pos="4254"/>
+        </w:tabs>
+        <w:ind w:start="4254" w:hanging="283"/>
+      </w:pPr>
+      <w:rPr>
+        <w:rFonts w:ascii="Symbol" w:hAnsi="Symbol" w:cs="Symbol" w:hint="default"/>
+      </w:rPr>
+    </w:lvl>
+    <w:lvl w:ilvl="6">
+      <w:start w:val="1"/>
+      <w:numFmt w:val="bullet"/>
+      <w:lvlText w:val=""/>
+      <w:lvlJc w:val="start"/>
+      <w:pPr>
+        <w:tabs>
+          <w:tab w:val="num" w:pos="4963"/>
+        </w:tabs>
+        <w:ind w:start="4963" w:hanging="283"/>
+      </w:pPr>
+      <w:rPr>
+        <w:rFonts w:ascii="Symbol" w:hAnsi="Symbol" w:cs="Symbol" w:hint="default"/>
+      </w:rPr>
+    </w:lvl>
+    <w:lvl w:ilvl="7">
+      <w:start w:val="1"/>
+      <w:numFmt w:val="bullet"/>
+      <w:lvlText w:val=""/>
+      <w:lvlJc w:val="start"/>
+      <w:pPr>
+        <w:tabs>
+          <w:tab w:val="num" w:pos="5672"/>
+        </w:tabs>
+        <w:ind w:start="5672" w:hanging="283"/>
+      </w:pPr>
+      <w:rPr>
+        <w:rFonts w:ascii="Symbol" w:hAnsi="Symbol" w:cs="Symbol" w:hint="default"/>
+      </w:rPr>
+    </w:lvl>
+    <w:lvl w:ilvl="8">
+      <w:start w:val="1"/>
+      <w:numFmt w:val="bullet"/>
+      <w:lvlText w:val=""/>
+      <w:lvlJc w:val="start"/>
+      <w:pPr>
+        <w:tabs>
+          <w:tab w:val="num" w:pos="6381"/>
+        </w:tabs>
+        <w:ind w:start="6381" w:hanging="283"/>
+      </w:pPr>
+      <w:rPr>
+        <w:rFonts w:ascii="Symbol" w:hAnsi="Symbol" w:cs="Symbol" w:hint="default"/>
+      </w:rPr>
+    </w:lvl>
+  </w:abstractNum>
+  <w:abstractNum w:abstractNumId="2">
+    <w:lvl w:ilvl="0">
+      <w:start w:val="1"/>
+      <w:numFmt w:val="bullet"/>
+      <w:lvlText w:val=""/>
+      <w:lvlJc w:val="start"/>
+      <w:pPr>
+        <w:tabs>
           <w:tab w:val="num" w:pos="0"/>
         </w:tabs>
         <w:ind w:start="720" w:hanging="360"/>
@@ -10307,143 +10444,6 @@
         <w:ind w:start="3600" w:hanging="360"/>
       </w:pPr>
       <w:rPr/>
-    </w:lvl>
-  </w:abstractNum>
-  <w:abstractNum w:abstractNumId="2">
-    <w:lvl w:ilvl="0">
-      <w:start w:val="1"/>
-      <w:numFmt w:val="bullet"/>
-      <w:lvlText w:val=""/>
-      <w:lvlJc w:val="start"/>
-      <w:pPr>
-        <w:tabs>
-          <w:tab w:val="num" w:pos="709"/>
-        </w:tabs>
-        <w:ind w:start="709" w:hanging="283"/>
-      </w:pPr>
-      <w:rPr>
-        <w:rFonts w:ascii="Symbol" w:hAnsi="Symbol" w:cs="Symbol" w:hint="default"/>
-      </w:rPr>
-    </w:lvl>
-    <w:lvl w:ilvl="1">
-      <w:start w:val="1"/>
-      <w:numFmt w:val="bullet"/>
-      <w:lvlText w:val=""/>
-      <w:lvlJc w:val="start"/>
-      <w:pPr>
-        <w:tabs>
-          <w:tab w:val="num" w:pos="1418"/>
-        </w:tabs>
-        <w:ind w:start="1418" w:hanging="283"/>
-      </w:pPr>
-      <w:rPr>
-        <w:rFonts w:ascii="Symbol" w:hAnsi="Symbol" w:cs="Symbol" w:hint="default"/>
-      </w:rPr>
-    </w:lvl>
-    <w:lvl w:ilvl="2">
-      <w:start w:val="1"/>
-      <w:numFmt w:val="bullet"/>
-      <w:lvlText w:val=""/>
-      <w:lvlJc w:val="start"/>
-      <w:pPr>
-        <w:tabs>
-          <w:tab w:val="num" w:pos="2127"/>
-        </w:tabs>
-        <w:ind w:start="2127" w:hanging="283"/>
-      </w:pPr>
-      <w:rPr>
-        <w:rFonts w:ascii="Symbol" w:hAnsi="Symbol" w:cs="Symbol" w:hint="default"/>
-      </w:rPr>
-    </w:lvl>
-    <w:lvl w:ilvl="3">
-      <w:start w:val="1"/>
-      <w:numFmt w:val="bullet"/>
-      <w:lvlText w:val=""/>
-      <w:lvlJc w:val="start"/>
-      <w:pPr>
-        <w:tabs>
-          <w:tab w:val="num" w:pos="2836"/>
-        </w:tabs>
-        <w:ind w:start="2836" w:hanging="283"/>
-      </w:pPr>
-      <w:rPr>
-        <w:rFonts w:ascii="Symbol" w:hAnsi="Symbol" w:cs="Symbol" w:hint="default"/>
-      </w:rPr>
-    </w:lvl>
-    <w:lvl w:ilvl="4">
-      <w:start w:val="1"/>
-      <w:numFmt w:val="bullet"/>
-      <w:lvlText w:val=""/>
-      <w:lvlJc w:val="start"/>
-      <w:pPr>
-        <w:tabs>
-          <w:tab w:val="num" w:pos="3545"/>
-        </w:tabs>
-        <w:ind w:start="3545" w:hanging="283"/>
-      </w:pPr>
-      <w:rPr>
-        <w:rFonts w:ascii="Symbol" w:hAnsi="Symbol" w:cs="Symbol" w:hint="default"/>
-      </w:rPr>
-    </w:lvl>
-    <w:lvl w:ilvl="5">
-      <w:start w:val="1"/>
-      <w:numFmt w:val="bullet"/>
-      <w:lvlText w:val=""/>
-      <w:lvlJc w:val="start"/>
-      <w:pPr>
-        <w:tabs>
-          <w:tab w:val="num" w:pos="4254"/>
-        </w:tabs>
-        <w:ind w:start="4254" w:hanging="283"/>
-      </w:pPr>
-      <w:rPr>
-        <w:rFonts w:ascii="Symbol" w:hAnsi="Symbol" w:cs="Symbol" w:hint="default"/>
-      </w:rPr>
-    </w:lvl>
-    <w:lvl w:ilvl="6">
-      <w:start w:val="1"/>
-      <w:numFmt w:val="bullet"/>
-      <w:lvlText w:val=""/>
-      <w:lvlJc w:val="start"/>
-      <w:pPr>
-        <w:tabs>
-          <w:tab w:val="num" w:pos="4963"/>
-        </w:tabs>
-        <w:ind w:start="4963" w:hanging="283"/>
-      </w:pPr>
-      <w:rPr>
-        <w:rFonts w:ascii="Symbol" w:hAnsi="Symbol" w:cs="Symbol" w:hint="default"/>
-      </w:rPr>
-    </w:lvl>
-    <w:lvl w:ilvl="7">
-      <w:start w:val="1"/>
-      <w:numFmt w:val="bullet"/>
-      <w:lvlText w:val=""/>
-      <w:lvlJc w:val="start"/>
-      <w:pPr>
-        <w:tabs>
-          <w:tab w:val="num" w:pos="5672"/>
-        </w:tabs>
-        <w:ind w:start="5672" w:hanging="283"/>
-      </w:pPr>
-      <w:rPr>
-        <w:rFonts w:ascii="Symbol" w:hAnsi="Symbol" w:cs="Symbol" w:hint="default"/>
-      </w:rPr>
-    </w:lvl>
-    <w:lvl w:ilvl="8">
-      <w:start w:val="1"/>
-      <w:numFmt w:val="bullet"/>
-      <w:lvlText w:val=""/>
-      <w:lvlJc w:val="start"/>
-      <w:pPr>
-        <w:tabs>
-          <w:tab w:val="num" w:pos="6381"/>
-        </w:tabs>
-        <w:ind w:start="6381" w:hanging="283"/>
-      </w:pPr>
-      <w:rPr>
-        <w:rFonts w:ascii="Symbol" w:hAnsi="Symbol" w:cs="Symbol" w:hint="default"/>
-      </w:rPr>
     </w:lvl>
   </w:abstractNum>
   <w:abstractNum w:abstractNumId="3">
@@ -10745,7 +10745,7 @@
   </w:style>
   <w:style w:type="paragraph" w:styleId="Heading1">
     <w:name w:val="heading 1"/>
-    <w:basedOn w:val="Ttulo"/>
+    <w:basedOn w:val="Ttulouser"/>
     <w:qFormat/>
     <w:pPr>
       <w:spacing w:before="320" w:after="160"/>
@@ -10762,7 +10762,7 @@
   </w:style>
   <w:style w:type="paragraph" w:styleId="Heading2">
     <w:name w:val="heading 2"/>
-    <w:basedOn w:val="Ttulo"/>
+    <w:basedOn w:val="Ttulouser"/>
     <w:qFormat/>
     <w:pPr>
       <w:spacing w:before="240" w:after="120"/>
@@ -10779,7 +10779,7 @@
   </w:style>
   <w:style w:type="paragraph" w:styleId="Heading3">
     <w:name w:val="heading 3"/>
-    <w:basedOn w:val="Ttulo"/>
+    <w:basedOn w:val="Ttulouser"/>
     <w:qFormat/>
     <w:pPr/>
     <w:rPr>
@@ -10790,7 +10790,7 @@
   </w:style>
   <w:style w:type="paragraph" w:styleId="Heading4">
     <w:name w:val="heading 4"/>
-    <w:basedOn w:val="Ttulo"/>
+    <w:basedOn w:val="Ttulouser"/>
     <w:qFormat/>
     <w:pPr/>
     <w:rPr>
@@ -10801,7 +10801,7 @@
   </w:style>
   <w:style w:type="paragraph" w:styleId="Heading5">
     <w:name w:val="heading 5"/>
-    <w:basedOn w:val="Ttulo"/>
+    <w:basedOn w:val="Ttulouser"/>
     <w:qFormat/>
     <w:pPr/>
     <w:rPr>
@@ -10810,7 +10810,7 @@
   </w:style>
   <w:style w:type="paragraph" w:styleId="Heading6">
     <w:name w:val="heading 6"/>
-    <w:basedOn w:val="Ttulo"/>
+    <w:basedOn w:val="Ttulouser"/>
     <w:qFormat/>
     <w:pPr/>
     <w:rPr>
@@ -10826,8 +10826,8 @@
       <w:u w:val="single"/>
     </w:rPr>
   </w:style>
-  <w:style w:type="character" w:styleId="Caracteresdenotaderodap">
-    <w:name w:val="Caracteres de nota de rodapé"/>
+  <w:style w:type="character" w:styleId="Caracteresdenotaderodapuser">
+    <w:name w:val="Caracteres de nota de rodapé (user)"/>
     <w:uiPriority w:val="99"/>
     <w:semiHidden/>
     <w:unhideWhenUsed/>
@@ -10836,8 +10836,8 @@
       <w:vertAlign w:val="superscript"/>
     </w:rPr>
   </w:style>
-  <w:style w:type="character" w:styleId="Caracteresdenotaderodapuser">
-    <w:name w:val="Caracteres de nota de rodapé (user)"/>
+  <w:style w:type="character" w:styleId="Caracteresdenotaderodap">
+    <w:name w:val="Caracteres de nota de rodapé"/>
     <w:qFormat/>
     <w:rPr>
       <w:vertAlign w:val="superscript"/>
@@ -10860,8 +10860,8 @@
       <w:szCs w:val="20"/>
     </w:rPr>
   </w:style>
-  <w:style w:type="character" w:styleId="Caracteresdenotadefim">
-    <w:name w:val="Caracteres de nota de fim"/>
+  <w:style w:type="character" w:styleId="Caracteresdenotadefimuser">
+    <w:name w:val="Caracteres de nota de fim (user)"/>
     <w:uiPriority w:val="99"/>
     <w:semiHidden/>
     <w:unhideWhenUsed/>
@@ -10870,8 +10870,8 @@
       <w:vertAlign w:val="superscript"/>
     </w:rPr>
   </w:style>
-  <w:style w:type="character" w:styleId="Caracteresdenotadefimuser">
-    <w:name w:val="Caracteres de nota de fim (user)"/>
+  <w:style w:type="character" w:styleId="Caracteresdenotadefim">
+    <w:name w:val="Caracteres de nota de fim"/>
     <w:qFormat/>
     <w:rPr>
       <w:vertAlign w:val="superscript"/>
@@ -10894,25 +10894,25 @@
       <w:szCs w:val="20"/>
     </w:rPr>
   </w:style>
+  <w:style w:type="character" w:styleId="Vnculodendiceuser">
+    <w:name w:val="Vínculo de índice (user)"/>
+    <w:qFormat/>
+    <w:rPr/>
+  </w:style>
   <w:style w:type="character" w:styleId="Vnculodendice">
     <w:name w:val="Vínculo de índice"/>
     <w:qFormat/>
     <w:rPr/>
   </w:style>
-  <w:style w:type="character" w:styleId="Vnculodendiceuser">
-    <w:name w:val="Vínculo de índice (user)"/>
-    <w:qFormat/>
-    <w:rPr/>
-  </w:style>
-  <w:style w:type="character" w:styleId="Cdigo-fonteuser">
-    <w:name w:val="Código-fonte (user)"/>
+  <w:style w:type="character" w:styleId="Cdigo-fonte">
+    <w:name w:val="Código-fonte"/>
     <w:qFormat/>
     <w:rPr>
       <w:rFonts w:ascii="Liberation Mono" w:hAnsi="Liberation Mono" w:eastAsia="NSimSun" w:cs="Liberation Mono"/>
     </w:rPr>
   </w:style>
-  <w:style w:type="character" w:styleId="Marcadoresuser">
-    <w:name w:val="Marcadores (user)"/>
+  <w:style w:type="character" w:styleId="Marcadores">
+    <w:name w:val="Marcadores"/>
     <w:qFormat/>
     <w:rPr>
       <w:rFonts w:ascii="OpenSymbol" w:hAnsi="OpenSymbol" w:eastAsia="OpenSymbol" w:cs="OpenSymbol"/>
@@ -11004,7 +11004,7 @@
   </w:style>
   <w:style w:type="paragraph" w:styleId="Title">
     <w:name w:val="Title"/>
-    <w:basedOn w:val="Ttulo"/>
+    <w:basedOn w:val="Ttulouser"/>
     <w:qFormat/>
     <w:pPr/>
     <w:rPr>
@@ -11082,6 +11082,13 @@
       <w:szCs w:val="20"/>
     </w:rPr>
   </w:style>
+  <w:style w:type="paragraph" w:styleId="Cabealhoerodapuser">
+    <w:name w:val="Cabeçalho e rodapé (user)"/>
+    <w:basedOn w:val="Normal"/>
+    <w:qFormat/>
+    <w:pPr/>
+    <w:rPr/>
+  </w:style>
   <w:style w:type="paragraph" w:styleId="Cabealhoerodap">
     <w:name w:val="Cabeçalho e rodapé"/>
     <w:basedOn w:val="Normal"/>
@@ -11089,28 +11096,21 @@
     <w:pPr/>
     <w:rPr/>
   </w:style>
-  <w:style w:type="paragraph" w:styleId="Cabealhoerodapuser">
-    <w:name w:val="Cabeçalho e rodapé (user)"/>
-    <w:basedOn w:val="Normal"/>
-    <w:qFormat/>
-    <w:pPr/>
-    <w:rPr/>
-  </w:style>
   <w:style w:type="paragraph" w:styleId="Header">
     <w:name w:val="header"/>
-    <w:basedOn w:val="Cabealhoerodap"/>
+    <w:basedOn w:val="Cabealhoerodapuser"/>
     <w:pPr/>
     <w:rPr/>
   </w:style>
   <w:style w:type="paragraph" w:styleId="Footer">
     <w:name w:val="footer"/>
-    <w:basedOn w:val="Cabealhoerodap"/>
+    <w:basedOn w:val="Cabealhoerodapuser"/>
     <w:pPr/>
     <w:rPr/>
   </w:style>
   <w:style w:type="paragraph" w:styleId="IndexHeading">
     <w:name w:val="index heading"/>
-    <w:basedOn w:val="Ttulo"/>
+    <w:basedOn w:val="Ttulouser"/>
     <w:pPr>
       <w:suppressLineNumbers/>
       <w:ind w:hanging="0" w:start="0"/>
@@ -11139,7 +11139,7 @@
   </w:style>
   <w:style w:type="paragraph" w:styleId="TOC1">
     <w:name w:val="toc 1"/>
-    <w:basedOn w:val="ndice"/>
+    <w:basedOn w:val="ndiceuser"/>
     <w:pPr>
       <w:tabs>
         <w:tab w:val="clear" w:pos="720"/>
@@ -11151,7 +11151,7 @@
   </w:style>
   <w:style w:type="paragraph" w:styleId="TOC2">
     <w:name w:val="toc 2"/>
-    <w:basedOn w:val="ndice"/>
+    <w:basedOn w:val="ndiceuser"/>
     <w:pPr>
       <w:tabs>
         <w:tab w:val="clear" w:pos="720"/>
@@ -11161,8 +11161,8 @@
     </w:pPr>
     <w:rPr/>
   </w:style>
-  <w:style w:type="paragraph" w:styleId="Blocodecitaouser">
-    <w:name w:val="Bloco de citação (user)"/>
+  <w:style w:type="paragraph" w:styleId="Blocodecitao">
+    <w:name w:val="Bloco de citação"/>
     <w:basedOn w:val="Normal"/>
     <w:qFormat/>
     <w:pPr>

</xml_diff>